<commit_message>
chore: new style format for requirements document.
</commit_message>
<xml_diff>
--- a/02-Documentation/02-requirements/requirements.docx
+++ b/02-Documentation/02-requirements/requirements.docx
@@ -57,6 +57,10 @@
         <w:tc>
           <w:tcPr>
             <w:tcW w:w="1617" w:type="dxa"/>
+            <w:tcBorders>
+              <w:bottom w:val="nil"/>
+            </w:tcBorders>
+            <w:shd w:val="clear" w:color="auto" w:fill="8EAADB" w:themeFill="accent1" w:themeFillTint="99"/>
           </w:tcPr>
           <w:p>
             <w:pPr>
@@ -65,6 +69,7 @@
                 <w:rFonts w:ascii="Arial" w:hAnsi="Arial" w:cs="Arial"/>
                 <w:b/>
                 <w:bCs/>
+                <w:color w:val="FFFFFF" w:themeColor="background1"/>
                 <w:lang w:val="es-ES"/>
               </w:rPr>
             </w:pPr>
@@ -73,6 +78,7 @@
                 <w:rFonts w:ascii="Arial" w:hAnsi="Arial" w:cs="Arial"/>
                 <w:b/>
                 <w:bCs/>
+                <w:color w:val="FFFFFF" w:themeColor="background1"/>
                 <w:lang w:val="es-ES"/>
               </w:rPr>
               <w:t>ID</w:t>
@@ -82,6 +88,10 @@
         <w:tc>
           <w:tcPr>
             <w:tcW w:w="2074" w:type="dxa"/>
+            <w:tcBorders>
+              <w:bottom w:val="nil"/>
+            </w:tcBorders>
+            <w:shd w:val="clear" w:color="auto" w:fill="8EAADB" w:themeFill="accent1" w:themeFillTint="99"/>
           </w:tcPr>
           <w:p>
             <w:pPr>
@@ -90,6 +100,7 @@
                 <w:rFonts w:ascii="Arial" w:hAnsi="Arial" w:cs="Arial"/>
                 <w:b/>
                 <w:bCs/>
+                <w:color w:val="FFFFFF" w:themeColor="background1"/>
                 <w:lang w:val="es-ES"/>
               </w:rPr>
             </w:pPr>
@@ -98,6 +109,7 @@
                 <w:rFonts w:ascii="Arial" w:hAnsi="Arial" w:cs="Arial"/>
                 <w:b/>
                 <w:bCs/>
+                <w:color w:val="FFFFFF" w:themeColor="background1"/>
                 <w:lang w:val="es-ES"/>
               </w:rPr>
               <w:t>REQUERIMIENTO</w:t>
@@ -107,6 +119,10 @@
         <w:tc>
           <w:tcPr>
             <w:tcW w:w="1651" w:type="dxa"/>
+            <w:tcBorders>
+              <w:bottom w:val="nil"/>
+            </w:tcBorders>
+            <w:shd w:val="clear" w:color="auto" w:fill="8EAADB" w:themeFill="accent1" w:themeFillTint="99"/>
           </w:tcPr>
           <w:p>
             <w:pPr>
@@ -115,6 +131,7 @@
                 <w:rFonts w:ascii="Arial" w:hAnsi="Arial" w:cs="Arial"/>
                 <w:b/>
                 <w:bCs/>
+                <w:color w:val="FFFFFF" w:themeColor="background1"/>
                 <w:lang w:val="es-ES"/>
               </w:rPr>
             </w:pPr>
@@ -123,6 +140,7 @@
                 <w:rFonts w:ascii="Arial" w:hAnsi="Arial" w:cs="Arial"/>
                 <w:b/>
                 <w:bCs/>
+                <w:color w:val="FFFFFF" w:themeColor="background1"/>
                 <w:lang w:val="es-ES"/>
               </w:rPr>
               <w:t>TIPO</w:t>
@@ -132,6 +150,10 @@
         <w:tc>
           <w:tcPr>
             <w:tcW w:w="1731" w:type="dxa"/>
+            <w:tcBorders>
+              <w:bottom w:val="nil"/>
+            </w:tcBorders>
+            <w:shd w:val="clear" w:color="auto" w:fill="8EAADB" w:themeFill="accent1" w:themeFillTint="99"/>
           </w:tcPr>
           <w:p>
             <w:pPr>
@@ -140,6 +162,7 @@
                 <w:rFonts w:ascii="Arial" w:hAnsi="Arial" w:cs="Arial"/>
                 <w:b/>
                 <w:bCs/>
+                <w:color w:val="FFFFFF" w:themeColor="background1"/>
                 <w:lang w:val="es-ES"/>
               </w:rPr>
             </w:pPr>
@@ -148,6 +171,7 @@
                 <w:rFonts w:ascii="Arial" w:hAnsi="Arial" w:cs="Arial"/>
                 <w:b/>
                 <w:bCs/>
+                <w:color w:val="FFFFFF" w:themeColor="background1"/>
                 <w:lang w:val="es-ES"/>
               </w:rPr>
               <w:t>PRIORIDAD</w:t>
@@ -157,6 +181,10 @@
         <w:tc>
           <w:tcPr>
             <w:tcW w:w="3270" w:type="dxa"/>
+            <w:tcBorders>
+              <w:bottom w:val="nil"/>
+            </w:tcBorders>
+            <w:shd w:val="clear" w:color="auto" w:fill="8EAADB" w:themeFill="accent1" w:themeFillTint="99"/>
           </w:tcPr>
           <w:p>
             <w:pPr>
@@ -165,6 +193,7 @@
                 <w:rFonts w:ascii="Arial" w:hAnsi="Arial" w:cs="Arial"/>
                 <w:b/>
                 <w:bCs/>
+                <w:color w:val="FFFFFF" w:themeColor="background1"/>
                 <w:lang w:val="es-ES"/>
               </w:rPr>
             </w:pPr>
@@ -173,6 +202,7 @@
                 <w:rFonts w:ascii="Arial" w:hAnsi="Arial" w:cs="Arial"/>
                 <w:b/>
                 <w:bCs/>
+                <w:color w:val="FFFFFF" w:themeColor="background1"/>
                 <w:lang w:val="es-ES"/>
               </w:rPr>
               <w:t>CRITERIO DE ACEPTACIÓN</w:t>
@@ -184,6 +214,9 @@
         <w:tc>
           <w:tcPr>
             <w:tcW w:w="1617" w:type="dxa"/>
+            <w:tcBorders>
+              <w:top w:val="nil"/>
+            </w:tcBorders>
           </w:tcPr>
           <w:p>
             <w:pPr>
@@ -214,6 +247,9 @@
         <w:tc>
           <w:tcPr>
             <w:tcW w:w="2074" w:type="dxa"/>
+            <w:tcBorders>
+              <w:top w:val="nil"/>
+            </w:tcBorders>
           </w:tcPr>
           <w:p>
             <w:pPr>
@@ -235,15 +271,20 @@
         <w:tc>
           <w:tcPr>
             <w:tcW w:w="1651" w:type="dxa"/>
-          </w:tcPr>
-          <w:p>
-            <w:pPr>
-              <w:jc w:val="center"/>
-              <w:rPr>
-                <w:rFonts w:ascii="Arial" w:hAnsi="Arial" w:cs="Arial"/>
-                <w:lang w:val="es-ES"/>
-              </w:rPr>
-            </w:pPr>
+            <w:tcBorders>
+              <w:top w:val="nil"/>
+            </w:tcBorders>
+          </w:tcPr>
+          <w:p>
+            <w:pPr>
+              <w:jc w:val="center"/>
+              <w:rPr>
+                <w:rFonts w:ascii="Arial" w:hAnsi="Arial" w:cs="Arial"/>
+                <w:lang w:val="es-ES"/>
+              </w:rPr>
+            </w:pPr>
+            <w:bookmarkStart w:id="0" w:name="_GoBack"/>
+            <w:bookmarkEnd w:id="0"/>
           </w:p>
           <w:p>
             <w:pPr>
@@ -265,6 +306,9 @@
         <w:tc>
           <w:tcPr>
             <w:tcW w:w="1731" w:type="dxa"/>
+            <w:tcBorders>
+              <w:top w:val="nil"/>
+            </w:tcBorders>
           </w:tcPr>
           <w:p>
             <w:pPr>
@@ -295,6 +339,9 @@
         <w:tc>
           <w:tcPr>
             <w:tcW w:w="3270" w:type="dxa"/>
+            <w:tcBorders>
+              <w:top w:val="nil"/>
+            </w:tcBorders>
           </w:tcPr>
           <w:p>
             <w:pPr>
@@ -1154,21 +1201,7 @@
                 <w:rFonts w:ascii="Arial" w:hAnsi="Arial" w:cs="Arial"/>
                 <w:lang w:val="es-ES"/>
               </w:rPr>
-              <w:t xml:space="preserve">El sistema debe permitir al estudiante </w:t>
-            </w:r>
-            <w:r>
-              <w:rPr>
-                <w:rFonts w:ascii="Arial" w:hAnsi="Arial" w:cs="Arial"/>
-                <w:lang w:val="es-ES"/>
-              </w:rPr>
-              <w:t>cancelar</w:t>
-            </w:r>
-            <w:r>
-              <w:rPr>
-                <w:rFonts w:ascii="Arial" w:hAnsi="Arial" w:cs="Arial"/>
-                <w:lang w:val="es-ES"/>
-              </w:rPr>
-              <w:t xml:space="preserve"> sus asignaturas</w:t>
+              <w:t>El sistema debe permitir al estudiante cancelar sus asignaturas</w:t>
             </w:r>
           </w:p>
         </w:tc>
@@ -1343,28 +1376,7 @@
                 <w:rFonts w:ascii="Arial" w:hAnsi="Arial" w:cs="Arial"/>
                 <w:lang w:val="es-ES"/>
               </w:rPr>
-              <w:t xml:space="preserve">El sistema debe permitir al </w:t>
-            </w:r>
-            <w:r>
-              <w:rPr>
-                <w:rFonts w:ascii="Arial" w:hAnsi="Arial" w:cs="Arial"/>
-                <w:lang w:val="es-ES"/>
-              </w:rPr>
-              <w:t>estudiante realizar</w:t>
-            </w:r>
-            <w:r>
-              <w:rPr>
-                <w:rFonts w:ascii="Arial" w:hAnsi="Arial" w:cs="Arial"/>
-                <w:lang w:val="es-ES"/>
-              </w:rPr>
-              <w:t xml:space="preserve"> </w:t>
-            </w:r>
-            <w:r>
-              <w:rPr>
-                <w:rFonts w:ascii="Arial" w:hAnsi="Arial" w:cs="Arial"/>
-                <w:lang w:val="es-ES"/>
-              </w:rPr>
-              <w:t>solicitudes de paz y salvo.</w:t>
+              <w:t>El sistema debe permitir al estudiante realizar solicitudes de paz y salvo.</w:t>
             </w:r>
           </w:p>
         </w:tc>
@@ -1472,14 +1484,7 @@
                 <w:rFonts w:ascii="Arial" w:hAnsi="Arial" w:cs="Arial"/>
                 <w:lang w:val="es-ES"/>
               </w:rPr>
-              <w:t>El estudiante debe tener sesión activa</w:t>
-            </w:r>
-            <w:r>
-              <w:rPr>
-                <w:rFonts w:ascii="Arial" w:hAnsi="Arial" w:cs="Arial"/>
-                <w:lang w:val="es-ES"/>
-              </w:rPr>
-              <w:t xml:space="preserve"> y tener matricula financiera vigente.</w:t>
+              <w:t>El estudiante debe tener sesión activa y tener matricula financiera vigente.</w:t>
             </w:r>
           </w:p>
           <w:p>
@@ -3844,8 +3849,6 @@
               </w:rPr>
               <w:t xml:space="preserve"> u otras herramientas / técnicas avanzadas.</w:t>
             </w:r>
-            <w:bookmarkStart w:id="0" w:name="_GoBack"/>
-            <w:bookmarkEnd w:id="0"/>
           </w:p>
         </w:tc>
       </w:tr>

</xml_diff>

<commit_message>
docs: requirements document completed.
</commit_message>
<xml_diff>
--- a/02-Documentation/02-requirements/requirements.docx
+++ b/02-Documentation/02-requirements/requirements.docx
@@ -9,8 +9,6 @@
           <w:rFonts w:ascii="Arial" w:hAnsi="Arial" w:cs="Arial"/>
           <w:b/>
           <w:bCs/>
-          <w:sz w:val="40"/>
-          <w:szCs w:val="40"/>
           <w:lang w:val="es-ES"/>
         </w:rPr>
       </w:pPr>
@@ -19,8 +17,6 @@
           <w:rFonts w:ascii="Arial" w:hAnsi="Arial" w:cs="Arial"/>
           <w:b/>
           <w:bCs/>
-          <w:sz w:val="40"/>
-          <w:szCs w:val="40"/>
           <w:lang w:val="es-ES"/>
         </w:rPr>
         <w:t>REQUISITOS FUNCIONALES (RF) Y REQUISITOS NO FUNCIONALES (RNF):</w:t>
@@ -31,10 +27,6 @@
         <w:jc w:val="center"/>
         <w:rPr>
           <w:rFonts w:ascii="Arial" w:hAnsi="Arial" w:cs="Arial"/>
-          <w:b/>
-          <w:bCs/>
-          <w:sz w:val="40"/>
-          <w:szCs w:val="40"/>
           <w:lang w:val="es-ES"/>
         </w:rPr>
       </w:pPr>
@@ -67,8 +59,6 @@
               <w:jc w:val="center"/>
               <w:rPr>
                 <w:rFonts w:ascii="Arial" w:hAnsi="Arial" w:cs="Arial"/>
-                <w:b/>
-                <w:bCs/>
                 <w:color w:val="FFFFFF" w:themeColor="background1"/>
                 <w:lang w:val="es-ES"/>
               </w:rPr>
@@ -76,8 +66,6 @@
             <w:r>
               <w:rPr>
                 <w:rFonts w:ascii="Arial" w:hAnsi="Arial" w:cs="Arial"/>
-                <w:b/>
-                <w:bCs/>
                 <w:color w:val="FFFFFF" w:themeColor="background1"/>
                 <w:lang w:val="es-ES"/>
               </w:rPr>
@@ -98,8 +86,6 @@
               <w:jc w:val="center"/>
               <w:rPr>
                 <w:rFonts w:ascii="Arial" w:hAnsi="Arial" w:cs="Arial"/>
-                <w:b/>
-                <w:bCs/>
                 <w:color w:val="FFFFFF" w:themeColor="background1"/>
                 <w:lang w:val="es-ES"/>
               </w:rPr>
@@ -107,8 +93,6 @@
             <w:r>
               <w:rPr>
                 <w:rFonts w:ascii="Arial" w:hAnsi="Arial" w:cs="Arial"/>
-                <w:b/>
-                <w:bCs/>
                 <w:color w:val="FFFFFF" w:themeColor="background1"/>
                 <w:lang w:val="es-ES"/>
               </w:rPr>
@@ -129,8 +113,6 @@
               <w:jc w:val="center"/>
               <w:rPr>
                 <w:rFonts w:ascii="Arial" w:hAnsi="Arial" w:cs="Arial"/>
-                <w:b/>
-                <w:bCs/>
                 <w:color w:val="FFFFFF" w:themeColor="background1"/>
                 <w:lang w:val="es-ES"/>
               </w:rPr>
@@ -138,8 +120,6 @@
             <w:r>
               <w:rPr>
                 <w:rFonts w:ascii="Arial" w:hAnsi="Arial" w:cs="Arial"/>
-                <w:b/>
-                <w:bCs/>
                 <w:color w:val="FFFFFF" w:themeColor="background1"/>
                 <w:lang w:val="es-ES"/>
               </w:rPr>
@@ -160,8 +140,6 @@
               <w:jc w:val="center"/>
               <w:rPr>
                 <w:rFonts w:ascii="Arial" w:hAnsi="Arial" w:cs="Arial"/>
-                <w:b/>
-                <w:bCs/>
                 <w:color w:val="FFFFFF" w:themeColor="background1"/>
                 <w:lang w:val="es-ES"/>
               </w:rPr>
@@ -169,8 +147,6 @@
             <w:r>
               <w:rPr>
                 <w:rFonts w:ascii="Arial" w:hAnsi="Arial" w:cs="Arial"/>
-                <w:b/>
-                <w:bCs/>
                 <w:color w:val="FFFFFF" w:themeColor="background1"/>
                 <w:lang w:val="es-ES"/>
               </w:rPr>
@@ -191,8 +167,6 @@
               <w:jc w:val="center"/>
               <w:rPr>
                 <w:rFonts w:ascii="Arial" w:hAnsi="Arial" w:cs="Arial"/>
-                <w:b/>
-                <w:bCs/>
                 <w:color w:val="FFFFFF" w:themeColor="background1"/>
                 <w:lang w:val="es-ES"/>
               </w:rPr>
@@ -200,8 +174,6 @@
             <w:r>
               <w:rPr>
                 <w:rFonts w:ascii="Arial" w:hAnsi="Arial" w:cs="Arial"/>
-                <w:b/>
-                <w:bCs/>
                 <w:color w:val="FFFFFF" w:themeColor="background1"/>
                 <w:lang w:val="es-ES"/>
               </w:rPr>
@@ -283,8 +255,6 @@
                 <w:lang w:val="es-ES"/>
               </w:rPr>
             </w:pPr>
-            <w:bookmarkStart w:id="0" w:name="_GoBack"/>
-            <w:bookmarkEnd w:id="0"/>
           </w:p>
           <w:p>
             <w:pPr>
@@ -553,6 +523,7 @@
           </w:tcPr>
           <w:p>
             <w:pPr>
+              <w:jc w:val="center"/>
               <w:rPr>
                 <w:rFonts w:ascii="Arial" w:hAnsi="Arial" w:cs="Arial"/>
                 <w:lang w:val="es-ES"/>
@@ -644,6 +615,7 @@
           </w:p>
           <w:p>
             <w:pPr>
+              <w:jc w:val="center"/>
               <w:rPr>
                 <w:rFonts w:ascii="Arial" w:hAnsi="Arial" w:cs="Arial"/>
                 <w:lang w:val="es-ES"/>
@@ -684,7 +656,7 @@
                 <w:rFonts w:ascii="Arial" w:hAnsi="Arial" w:cs="Arial"/>
                 <w:lang w:val="es-ES"/>
               </w:rPr>
-              <w:t xml:space="preserve">El sistema debe permitir al estudiante crear solicitudes académicas de revisión de notas. </w:t>
+              <w:t>El sistema debe permitir al estudiante crear solicitudes académicas de revisión de notas.</w:t>
             </w:r>
           </w:p>
         </w:tc>
@@ -1546,15 +1518,7 @@
                 <w:rFonts w:ascii="Arial" w:hAnsi="Arial" w:cs="Arial"/>
                 <w:lang w:val="es-ES"/>
               </w:rPr>
-              <w:t xml:space="preserve">El sistema debe permitir al estudiante descargar los </w:t>
-            </w:r>
-            <w:r>
-              <w:rPr>
-                <w:rFonts w:ascii="Arial" w:hAnsi="Arial" w:cs="Arial"/>
-                <w:lang w:val="es-ES"/>
-              </w:rPr>
-              <w:lastRenderedPageBreak/>
-              <w:t>certificados generados.</w:t>
+              <w:t>El sistema debe permitir al estudiante descargar los certificados generados.</w:t>
             </w:r>
           </w:p>
         </w:tc>
@@ -1706,7 +1670,15 @@
                 <w:rFonts w:ascii="Arial" w:hAnsi="Arial" w:cs="Arial"/>
                 <w:lang w:val="es-ES"/>
               </w:rPr>
-              <w:t>El sistema debe permitir que el estudiante cancele solicitudes.</w:t>
+              <w:t xml:space="preserve">El sistema debe permitir que el </w:t>
+            </w:r>
+            <w:r>
+              <w:rPr>
+                <w:rFonts w:ascii="Arial" w:hAnsi="Arial" w:cs="Arial"/>
+                <w:lang w:val="es-ES"/>
+              </w:rPr>
+              <w:lastRenderedPageBreak/>
+              <w:t>estudiante cancele solicitudes.</w:t>
             </w:r>
           </w:p>
         </w:tc>
@@ -1764,6 +1736,7 @@
           </w:p>
           <w:p>
             <w:pPr>
+              <w:jc w:val="center"/>
               <w:rPr>
                 <w:rFonts w:ascii="Arial" w:hAnsi="Arial" w:cs="Arial"/>
                 <w:lang w:val="es-ES"/>
@@ -1804,7 +1777,15 @@
                 <w:rFonts w:ascii="Arial" w:hAnsi="Arial" w:cs="Arial"/>
                 <w:lang w:val="es-ES"/>
               </w:rPr>
-              <w:t>El estudiante debe tener sesión activa, debe existir la solicitud que quiere cancelar y la solicitud no debe estar ya respondida.</w:t>
+              <w:t xml:space="preserve">El estudiante debe tener sesión activa, debe existir la solicitud que quiere cancelar y </w:t>
+            </w:r>
+            <w:r>
+              <w:rPr>
+                <w:rFonts w:ascii="Arial" w:hAnsi="Arial" w:cs="Arial"/>
+                <w:lang w:val="es-ES"/>
+              </w:rPr>
+              <w:lastRenderedPageBreak/>
+              <w:t>la solicitud no debe estar ya respondida.</w:t>
             </w:r>
           </w:p>
         </w:tc>
@@ -1825,6 +1806,7 @@
           </w:p>
           <w:p>
             <w:pPr>
+              <w:jc w:val="center"/>
               <w:rPr>
                 <w:rFonts w:ascii="Arial" w:hAnsi="Arial" w:cs="Arial"/>
                 <w:lang w:val="es-ES"/>
@@ -2585,17 +2567,15 @@
                 <w:rFonts w:ascii="Arial" w:hAnsi="Arial" w:cs="Arial"/>
                 <w:lang w:val="es-ES"/>
               </w:rPr>
-              <w:t>RNF-01</w:t>
-            </w:r>
-          </w:p>
-          <w:p>
-            <w:pPr>
-              <w:jc w:val="center"/>
-              <w:rPr>
-                <w:rFonts w:ascii="Arial" w:hAnsi="Arial" w:cs="Arial"/>
-                <w:lang w:val="es-ES"/>
-              </w:rPr>
-            </w:pPr>
+              <w:t>RF-1</w:t>
+            </w:r>
+            <w:r>
+              <w:rPr>
+                <w:rFonts w:ascii="Arial" w:hAnsi="Arial" w:cs="Arial"/>
+                <w:lang w:val="es-ES"/>
+              </w:rPr>
+              <w:t>5</w:t>
+            </w:r>
           </w:p>
         </w:tc>
         <w:tc>
@@ -2613,9 +2593,23 @@
             <w:r>
               <w:rPr>
                 <w:rFonts w:ascii="Arial" w:hAnsi="Arial" w:cs="Arial"/>
-                <w:lang w:val="es-ES"/>
-              </w:rPr>
-              <w:t>La base de datos del sistema debe estar preparada para manejar bastante información.</w:t>
+              </w:rPr>
+              <w:t xml:space="preserve">El sistema debe permitir </w:t>
+            </w:r>
+            <w:r>
+              <w:rPr>
+                <w:rStyle w:val="Textoennegrita"/>
+                <w:rFonts w:ascii="Arial" w:hAnsi="Arial" w:cs="Arial"/>
+                <w:b w:val="0"/>
+                <w:bCs w:val="0"/>
+              </w:rPr>
+              <w:t>registrar estudiantes</w:t>
+            </w:r>
+            <w:r>
+              <w:rPr>
+                <w:rFonts w:ascii="Arial" w:hAnsi="Arial" w:cs="Arial"/>
+              </w:rPr>
+              <w:t xml:space="preserve"> con sus datos personales y académicos</w:t>
             </w:r>
           </w:p>
         </w:tc>
@@ -2654,7 +2648,7 @@
                 <w:rFonts w:ascii="Arial" w:hAnsi="Arial" w:cs="Arial"/>
                 <w:lang w:val="es-ES"/>
               </w:rPr>
-              <w:t>No funcional</w:t>
+              <w:t>Funcional</w:t>
             </w:r>
           </w:p>
         </w:tc>
@@ -2709,21 +2703,26 @@
                 <w:lang w:val="es-ES"/>
               </w:rPr>
             </w:pPr>
-          </w:p>
-          <w:p>
-            <w:pPr>
-              <w:jc w:val="center"/>
-              <w:rPr>
-                <w:rFonts w:ascii="Arial" w:hAnsi="Arial" w:cs="Arial"/>
-                <w:lang w:val="es-ES"/>
-              </w:rPr>
-            </w:pPr>
-            <w:r>
-              <w:rPr>
-                <w:rFonts w:ascii="Arial" w:hAnsi="Arial" w:cs="Arial"/>
-                <w:lang w:val="es-ES"/>
-              </w:rPr>
-              <w:t>La base de datos debe estar creada con buenas prácticas de diseño e índices.</w:t>
+            <w:r>
+              <w:rPr>
+                <w:rFonts w:ascii="Arial" w:hAnsi="Arial" w:cs="Arial"/>
+              </w:rPr>
+              <w:t xml:space="preserve">El sistema debe permitir </w:t>
+            </w:r>
+            <w:r>
+              <w:rPr>
+                <w:rStyle w:val="Textoennegrita"/>
+                <w:rFonts w:ascii="Arial" w:hAnsi="Arial" w:cs="Arial"/>
+                <w:b w:val="0"/>
+                <w:bCs w:val="0"/>
+              </w:rPr>
+              <w:t>diferenciar el acceso según el tipo de usuario</w:t>
+            </w:r>
+            <w:r>
+              <w:rPr>
+                <w:rFonts w:ascii="Arial" w:hAnsi="Arial" w:cs="Arial"/>
+              </w:rPr>
+              <w:t>, estudiante o funcionario.</w:t>
             </w:r>
           </w:p>
         </w:tc>
@@ -2759,21 +2758,19 @@
                 <w:lang w:val="es-ES"/>
               </w:rPr>
             </w:pPr>
-          </w:p>
-          <w:p>
-            <w:pPr>
-              <w:jc w:val="center"/>
-              <w:rPr>
-                <w:rFonts w:ascii="Arial" w:hAnsi="Arial" w:cs="Arial"/>
-                <w:lang w:val="es-ES"/>
-              </w:rPr>
-            </w:pPr>
-            <w:r>
-              <w:rPr>
-                <w:rFonts w:ascii="Arial" w:hAnsi="Arial" w:cs="Arial"/>
-                <w:lang w:val="es-ES"/>
-              </w:rPr>
-              <w:t>RNF-02</w:t>
+            <w:r>
+              <w:rPr>
+                <w:rFonts w:ascii="Arial" w:hAnsi="Arial" w:cs="Arial"/>
+                <w:lang w:val="es-ES"/>
+              </w:rPr>
+              <w:t>RF-1</w:t>
+            </w:r>
+            <w:r>
+              <w:rPr>
+                <w:rFonts w:ascii="Arial" w:hAnsi="Arial" w:cs="Arial"/>
+                <w:lang w:val="es-ES"/>
+              </w:rPr>
+              <w:t>6</w:t>
             </w:r>
           </w:p>
         </w:tc>
@@ -2792,9 +2789,23 @@
             <w:r>
               <w:rPr>
                 <w:rFonts w:ascii="Arial" w:hAnsi="Arial" w:cs="Arial"/>
-                <w:lang w:val="es-ES"/>
-              </w:rPr>
-              <w:t>Los certificados deben generarse en formato PDF, diseñada la plantilla por los creadores del proyecto.</w:t>
+              </w:rPr>
+              <w:t xml:space="preserve">El sistema debe permitir a los usuarios </w:t>
+            </w:r>
+            <w:r>
+              <w:rPr>
+                <w:rStyle w:val="Textoennegrita"/>
+                <w:rFonts w:ascii="Arial" w:hAnsi="Arial" w:cs="Arial"/>
+                <w:b w:val="0"/>
+                <w:bCs w:val="0"/>
+              </w:rPr>
+              <w:t>iniciar sesión mediante usuario y contraseña</w:t>
+            </w:r>
+            <w:r>
+              <w:rPr>
+                <w:rFonts w:ascii="Arial" w:hAnsi="Arial" w:cs="Arial"/>
+              </w:rPr>
+              <w:t>.</w:t>
             </w:r>
           </w:p>
         </w:tc>
@@ -2828,21 +2839,12 @@
                 <w:lang w:val="es-ES"/>
               </w:rPr>
             </w:pPr>
-          </w:p>
-          <w:p>
-            <w:pPr>
-              <w:jc w:val="center"/>
-              <w:rPr>
-                <w:rFonts w:ascii="Arial" w:hAnsi="Arial" w:cs="Arial"/>
-                <w:lang w:val="es-ES"/>
-              </w:rPr>
-            </w:pPr>
-            <w:r>
-              <w:rPr>
-                <w:rFonts w:ascii="Arial" w:hAnsi="Arial" w:cs="Arial"/>
-                <w:lang w:val="es-ES"/>
-              </w:rPr>
-              <w:t>No funcional</w:t>
+            <w:r>
+              <w:rPr>
+                <w:rFonts w:ascii="Arial" w:hAnsi="Arial" w:cs="Arial"/>
+                <w:lang w:val="es-ES"/>
+              </w:rPr>
+              <w:t>Funcional</w:t>
             </w:r>
           </w:p>
         </w:tc>
@@ -2876,21 +2878,12 @@
                 <w:lang w:val="es-ES"/>
               </w:rPr>
             </w:pPr>
-          </w:p>
-          <w:p>
-            <w:pPr>
-              <w:jc w:val="center"/>
-              <w:rPr>
-                <w:rFonts w:ascii="Arial" w:hAnsi="Arial" w:cs="Arial"/>
-                <w:lang w:val="es-ES"/>
-              </w:rPr>
-            </w:pPr>
-            <w:r>
-              <w:rPr>
-                <w:rFonts w:ascii="Arial" w:hAnsi="Arial" w:cs="Arial"/>
-                <w:lang w:val="es-ES"/>
-              </w:rPr>
-              <w:t>Media</w:t>
+            <w:r>
+              <w:rPr>
+                <w:rFonts w:ascii="Arial" w:hAnsi="Arial" w:cs="Arial"/>
+                <w:lang w:val="es-ES"/>
+              </w:rPr>
+              <w:t>Alta</w:t>
             </w:r>
           </w:p>
         </w:tc>
@@ -2918,9 +2911,14 @@
             <w:r>
               <w:rPr>
                 <w:rFonts w:ascii="Arial" w:hAnsi="Arial" w:cs="Arial"/>
-                <w:lang w:val="es-ES"/>
-              </w:rPr>
-              <w:t>Se debe usar alguna librería o servicio que facilite la generación del PDF, y el PDF ya debe estar diseñado su diseño.</w:t>
+              </w:rPr>
+              <w:t>El sistema valida las credenciales y permite el acceso cuando son correctas</w:t>
+            </w:r>
+            <w:r>
+              <w:rPr>
+                <w:rFonts w:ascii="Arial" w:hAnsi="Arial" w:cs="Arial"/>
+              </w:rPr>
+              <w:t>.</w:t>
             </w:r>
           </w:p>
         </w:tc>
@@ -2952,7 +2950,14 @@
                 <w:rFonts w:ascii="Arial" w:hAnsi="Arial" w:cs="Arial"/>
                 <w:lang w:val="es-ES"/>
               </w:rPr>
-              <w:t>RNF-03</w:t>
+              <w:t>RF-1</w:t>
+            </w:r>
+            <w:r>
+              <w:rPr>
+                <w:rFonts w:ascii="Arial" w:hAnsi="Arial" w:cs="Arial"/>
+                <w:lang w:val="es-ES"/>
+              </w:rPr>
+              <w:t>7</w:t>
             </w:r>
           </w:p>
         </w:tc>
@@ -2971,25 +2976,23 @@
             <w:r>
               <w:rPr>
                 <w:rFonts w:ascii="Arial" w:hAnsi="Arial" w:cs="Arial"/>
-                <w:lang w:val="es-ES"/>
-              </w:rPr>
-              <w:t xml:space="preserve">El sistema debe ser totalmente </w:t>
-            </w:r>
-            <w:proofErr w:type="spellStart"/>
-            <w:r>
-              <w:rPr>
-                <w:rFonts w:ascii="Arial" w:hAnsi="Arial" w:cs="Arial"/>
-                <w:lang w:val="es-ES"/>
-              </w:rPr>
-              <w:t>responsive</w:t>
-            </w:r>
-            <w:proofErr w:type="spellEnd"/>
-            <w:r>
-              <w:rPr>
-                <w:rFonts w:ascii="Arial" w:hAnsi="Arial" w:cs="Arial"/>
-                <w:lang w:val="es-ES"/>
-              </w:rPr>
-              <w:t>.</w:t>
+              </w:rPr>
+              <w:t xml:space="preserve">El sistema debe permitir </w:t>
+            </w:r>
+            <w:r>
+              <w:rPr>
+                <w:rStyle w:val="Textoennegrita"/>
+                <w:rFonts w:ascii="Arial" w:hAnsi="Arial" w:cs="Arial"/>
+                <w:b w:val="0"/>
+                <w:bCs w:val="0"/>
+              </w:rPr>
+              <w:t>diferenciar el acceso según el tipo de usuario</w:t>
+            </w:r>
+            <w:r>
+              <w:rPr>
+                <w:rFonts w:ascii="Arial" w:hAnsi="Arial" w:cs="Arial"/>
+              </w:rPr>
+              <w:t>, estudiante o funcionario.</w:t>
             </w:r>
           </w:p>
         </w:tc>
@@ -3014,21 +3017,22 @@
                 <w:lang w:val="es-ES"/>
               </w:rPr>
             </w:pPr>
-            <w:r>
-              <w:rPr>
-                <w:rFonts w:ascii="Arial" w:hAnsi="Arial" w:cs="Arial"/>
-                <w:lang w:val="es-ES"/>
-              </w:rPr>
-              <w:t>No funcional</w:t>
-            </w:r>
-          </w:p>
-          <w:p>
-            <w:pPr>
-              <w:rPr>
-                <w:rFonts w:ascii="Arial" w:hAnsi="Arial" w:cs="Arial"/>
-                <w:lang w:val="es-ES"/>
-              </w:rPr>
-            </w:pPr>
+          </w:p>
+          <w:p>
+            <w:pPr>
+              <w:jc w:val="center"/>
+              <w:rPr>
+                <w:rFonts w:ascii="Arial" w:hAnsi="Arial" w:cs="Arial"/>
+                <w:lang w:val="es-ES"/>
+              </w:rPr>
+            </w:pPr>
+            <w:r>
+              <w:rPr>
+                <w:rFonts w:ascii="Arial" w:hAnsi="Arial" w:cs="Arial"/>
+                <w:lang w:val="es-ES"/>
+              </w:rPr>
+              <w:t>Funcional</w:t>
+            </w:r>
           </w:p>
         </w:tc>
         <w:tc>
@@ -3052,6 +3056,15 @@
                 <w:lang w:val="es-ES"/>
               </w:rPr>
             </w:pPr>
+          </w:p>
+          <w:p>
+            <w:pPr>
+              <w:jc w:val="center"/>
+              <w:rPr>
+                <w:rFonts w:ascii="Arial" w:hAnsi="Arial" w:cs="Arial"/>
+                <w:lang w:val="es-ES"/>
+              </w:rPr>
+            </w:pPr>
             <w:r>
               <w:rPr>
                 <w:rFonts w:ascii="Arial" w:hAnsi="Arial" w:cs="Arial"/>
@@ -3073,60 +3086,20 @@
                 <w:lang w:val="es-ES"/>
               </w:rPr>
             </w:pPr>
-            <w:r>
-              <w:rPr>
-                <w:rFonts w:ascii="Arial" w:hAnsi="Arial" w:cs="Arial"/>
-                <w:lang w:val="es-ES"/>
-              </w:rPr>
-              <w:t xml:space="preserve">Usar </w:t>
-            </w:r>
-            <w:proofErr w:type="spellStart"/>
-            <w:r>
-              <w:rPr>
-                <w:rFonts w:ascii="Arial" w:hAnsi="Arial" w:cs="Arial"/>
-                <w:lang w:val="es-ES"/>
-              </w:rPr>
-              <w:t>JQuerys</w:t>
-            </w:r>
-            <w:proofErr w:type="spellEnd"/>
-            <w:r>
-              <w:rPr>
-                <w:rFonts w:ascii="Arial" w:hAnsi="Arial" w:cs="Arial"/>
-                <w:lang w:val="es-ES"/>
-              </w:rPr>
-              <w:t xml:space="preserve">, </w:t>
-            </w:r>
-            <w:proofErr w:type="spellStart"/>
-            <w:r>
-              <w:rPr>
-                <w:rFonts w:ascii="Arial" w:hAnsi="Arial" w:cs="Arial"/>
-                <w:lang w:val="es-ES"/>
-              </w:rPr>
-              <w:t>grid</w:t>
-            </w:r>
-            <w:proofErr w:type="spellEnd"/>
-            <w:r>
-              <w:rPr>
-                <w:rFonts w:ascii="Arial" w:hAnsi="Arial" w:cs="Arial"/>
-                <w:lang w:val="es-ES"/>
-              </w:rPr>
-              <w:t xml:space="preserve"> o </w:t>
-            </w:r>
-            <w:proofErr w:type="spellStart"/>
-            <w:r>
-              <w:rPr>
-                <w:rFonts w:ascii="Arial" w:hAnsi="Arial" w:cs="Arial"/>
-                <w:lang w:val="es-ES"/>
-              </w:rPr>
-              <w:t>flexbox</w:t>
-            </w:r>
-            <w:proofErr w:type="spellEnd"/>
-            <w:r>
-              <w:rPr>
-                <w:rFonts w:ascii="Arial" w:hAnsi="Arial" w:cs="Arial"/>
-                <w:lang w:val="es-ES"/>
-              </w:rPr>
-              <w:t xml:space="preserve"> en el diseño de la web.</w:t>
+          </w:p>
+          <w:p>
+            <w:pPr>
+              <w:jc w:val="center"/>
+              <w:rPr>
+                <w:rFonts w:ascii="Arial" w:hAnsi="Arial" w:cs="Arial"/>
+                <w:lang w:val="es-ES"/>
+              </w:rPr>
+            </w:pPr>
+            <w:r>
+              <w:rPr>
+                <w:rFonts w:ascii="Arial" w:hAnsi="Arial" w:cs="Arial"/>
+              </w:rPr>
+              <w:t>Cada usuario visualiza únicamente las opciones correspondientes a su rol.</w:t>
             </w:r>
           </w:p>
         </w:tc>
@@ -3167,7 +3140,14 @@
                 <w:rFonts w:ascii="Arial" w:hAnsi="Arial" w:cs="Arial"/>
                 <w:lang w:val="es-ES"/>
               </w:rPr>
-              <w:t>RNF-04</w:t>
+              <w:t>RF-1</w:t>
+            </w:r>
+            <w:r>
+              <w:rPr>
+                <w:rFonts w:ascii="Arial" w:hAnsi="Arial" w:cs="Arial"/>
+                <w:lang w:val="es-ES"/>
+              </w:rPr>
+              <w:t>8</w:t>
             </w:r>
           </w:p>
         </w:tc>
@@ -3180,16 +3160,29 @@
               <w:jc w:val="center"/>
               <w:rPr>
                 <w:rFonts w:ascii="Arial" w:hAnsi="Arial" w:cs="Arial"/>
-                <w:u w:val="single"/>
-                <w:lang w:val="es-ES"/>
-              </w:rPr>
-            </w:pPr>
-            <w:r>
-              <w:rPr>
-                <w:rFonts w:ascii="Arial" w:hAnsi="Arial" w:cs="Arial"/>
-                <w:lang w:val="es-ES"/>
-              </w:rPr>
-              <w:t>El sistema debe responder ante alguna solicitud u operación en un tiempo de 3 segundos.</w:t>
+                <w:lang w:val="es-ES"/>
+              </w:rPr>
+            </w:pPr>
+            <w:r>
+              <w:rPr>
+                <w:rFonts w:ascii="Arial" w:hAnsi="Arial" w:cs="Arial"/>
+              </w:rPr>
+              <w:t xml:space="preserve">El sistema debe permitir a los estudiantes </w:t>
+            </w:r>
+            <w:r>
+              <w:rPr>
+                <w:rStyle w:val="Textoennegrita"/>
+                <w:rFonts w:ascii="Arial" w:hAnsi="Arial" w:cs="Arial"/>
+                <w:b w:val="0"/>
+                <w:bCs w:val="0"/>
+              </w:rPr>
+              <w:t>crear solicitudes académicas</w:t>
+            </w:r>
+            <w:r>
+              <w:rPr>
+                <w:rFonts w:ascii="Arial" w:hAnsi="Arial" w:cs="Arial"/>
+              </w:rPr>
+              <w:t>.</w:t>
             </w:r>
           </w:p>
         </w:tc>
@@ -3228,7 +3221,7 @@
                 <w:rFonts w:ascii="Arial" w:hAnsi="Arial" w:cs="Arial"/>
                 <w:lang w:val="es-ES"/>
               </w:rPr>
-              <w:t>No funcional</w:t>
+              <w:t>Funcional</w:t>
             </w:r>
           </w:p>
         </w:tc>
@@ -3277,27 +3270,25 @@
           </w:tcPr>
           <w:p>
             <w:pPr>
-              <w:jc w:val="center"/>
-              <w:rPr>
-                <w:rFonts w:ascii="Arial" w:hAnsi="Arial" w:cs="Arial"/>
-                <w:lang w:val="es-ES"/>
-              </w:rPr>
-            </w:pPr>
-          </w:p>
-          <w:p>
-            <w:pPr>
-              <w:jc w:val="center"/>
-              <w:rPr>
-                <w:rFonts w:ascii="Arial" w:hAnsi="Arial" w:cs="Arial"/>
-                <w:lang w:val="es-ES"/>
-              </w:rPr>
-            </w:pPr>
-            <w:r>
-              <w:rPr>
-                <w:rFonts w:ascii="Arial" w:hAnsi="Arial" w:cs="Arial"/>
-                <w:lang w:val="es-ES"/>
-              </w:rPr>
-              <w:t>La base de datos del sistema debe tener las operaciones correctas y escritas de la mejor manera, usando buenas prácticas.</w:t>
+              <w:rPr>
+                <w:rFonts w:ascii="Arial" w:hAnsi="Arial" w:cs="Arial"/>
+                <w:lang w:val="es-ES"/>
+              </w:rPr>
+            </w:pPr>
+          </w:p>
+          <w:p>
+            <w:pPr>
+              <w:jc w:val="center"/>
+              <w:rPr>
+                <w:rFonts w:ascii="Arial" w:hAnsi="Arial" w:cs="Arial"/>
+                <w:lang w:val="es-ES"/>
+              </w:rPr>
+            </w:pPr>
+            <w:r>
+              <w:rPr>
+                <w:rFonts w:ascii="Arial" w:hAnsi="Arial" w:cs="Arial"/>
+              </w:rPr>
+              <w:t>La solicitud se registra y recibe un número identificador único.</w:t>
             </w:r>
           </w:p>
         </w:tc>
@@ -3324,12 +3315,21 @@
                 <w:lang w:val="es-ES"/>
               </w:rPr>
             </w:pPr>
-            <w:r>
-              <w:rPr>
-                <w:rFonts w:ascii="Arial" w:hAnsi="Arial" w:cs="Arial"/>
-                <w:lang w:val="es-ES"/>
-              </w:rPr>
-              <w:t>RNF-05</w:t>
+          </w:p>
+          <w:p>
+            <w:pPr>
+              <w:jc w:val="center"/>
+              <w:rPr>
+                <w:rFonts w:ascii="Arial" w:hAnsi="Arial" w:cs="Arial"/>
+                <w:lang w:val="es-ES"/>
+              </w:rPr>
+            </w:pPr>
+            <w:r>
+              <w:rPr>
+                <w:rFonts w:ascii="Arial" w:hAnsi="Arial" w:cs="Arial"/>
+                <w:lang w:val="es-ES"/>
+              </w:rPr>
+              <w:t>RF-19</w:t>
             </w:r>
           </w:p>
         </w:tc>
@@ -3348,9 +3348,23 @@
             <w:r>
               <w:rPr>
                 <w:rFonts w:ascii="Arial" w:hAnsi="Arial" w:cs="Arial"/>
-                <w:lang w:val="es-ES"/>
-              </w:rPr>
-              <w:t>La interfaz del sistema debe ser amigable y estéticamente bonita.</w:t>
+              </w:rPr>
+              <w:t xml:space="preserve">El sistema debe permitir seleccionar el </w:t>
+            </w:r>
+            <w:r>
+              <w:rPr>
+                <w:rStyle w:val="Textoennegrita"/>
+                <w:rFonts w:ascii="Arial" w:hAnsi="Arial" w:cs="Arial"/>
+                <w:b w:val="0"/>
+                <w:bCs w:val="0"/>
+              </w:rPr>
+              <w:t>tipo de solicitud académica</w:t>
+            </w:r>
+            <w:r>
+              <w:rPr>
+                <w:rFonts w:ascii="Arial" w:hAnsi="Arial" w:cs="Arial"/>
+              </w:rPr>
+              <w:t xml:space="preserve"> al momento de crearla.</w:t>
             </w:r>
           </w:p>
         </w:tc>
@@ -3384,12 +3398,21 @@
                 <w:lang w:val="es-ES"/>
               </w:rPr>
             </w:pPr>
-            <w:r>
-              <w:rPr>
-                <w:rFonts w:ascii="Arial" w:hAnsi="Arial" w:cs="Arial"/>
-                <w:lang w:val="es-ES"/>
-              </w:rPr>
-              <w:t>No funcional</w:t>
+          </w:p>
+          <w:p>
+            <w:pPr>
+              <w:jc w:val="center"/>
+              <w:rPr>
+                <w:rFonts w:ascii="Arial" w:hAnsi="Arial" w:cs="Arial"/>
+                <w:lang w:val="es-ES"/>
+              </w:rPr>
+            </w:pPr>
+            <w:r>
+              <w:rPr>
+                <w:rFonts w:ascii="Arial" w:hAnsi="Arial" w:cs="Arial"/>
+                <w:lang w:val="es-ES"/>
+              </w:rPr>
+              <w:t>Funcional</w:t>
             </w:r>
           </w:p>
         </w:tc>
@@ -3423,12 +3446,21 @@
                 <w:lang w:val="es-ES"/>
               </w:rPr>
             </w:pPr>
-            <w:r>
-              <w:rPr>
-                <w:rFonts w:ascii="Arial" w:hAnsi="Arial" w:cs="Arial"/>
-                <w:lang w:val="es-ES"/>
-              </w:rPr>
-              <w:t>Media</w:t>
+          </w:p>
+          <w:p>
+            <w:pPr>
+              <w:jc w:val="center"/>
+              <w:rPr>
+                <w:rFonts w:ascii="Arial" w:hAnsi="Arial" w:cs="Arial"/>
+                <w:lang w:val="es-ES"/>
+              </w:rPr>
+            </w:pPr>
+            <w:r>
+              <w:rPr>
+                <w:rFonts w:ascii="Arial" w:hAnsi="Arial" w:cs="Arial"/>
+                <w:lang w:val="es-ES"/>
+              </w:rPr>
+              <w:t>Alta</w:t>
             </w:r>
           </w:p>
         </w:tc>
@@ -3456,9 +3488,8 @@
             <w:r>
               <w:rPr>
                 <w:rFonts w:ascii="Arial" w:hAnsi="Arial" w:cs="Arial"/>
-                <w:lang w:val="es-ES"/>
-              </w:rPr>
-              <w:t>Respetando los colores del branding establecidos por los creadores del proyecto.</w:t>
+              </w:rPr>
+              <w:t>El estudiante puede seleccionar entre los tipos de solicitudes disponibles, como certificado, revisión de notas, cancelación de asignatura o paz y salvo.</w:t>
             </w:r>
           </w:p>
         </w:tc>
@@ -3499,7 +3530,7 @@
                 <w:rFonts w:ascii="Arial" w:hAnsi="Arial" w:cs="Arial"/>
                 <w:lang w:val="es-ES"/>
               </w:rPr>
-              <w:t>RNF-06</w:t>
+              <w:t>RF-20</w:t>
             </w:r>
           </w:p>
         </w:tc>
@@ -3518,9 +3549,23 @@
             <w:r>
               <w:rPr>
                 <w:rFonts w:ascii="Arial" w:hAnsi="Arial" w:cs="Arial"/>
-                <w:lang w:val="es-ES"/>
-              </w:rPr>
-              <w:t>Las contraseñas guardadas en la base de datos deben guardarse en formato hash.</w:t>
+              </w:rPr>
+              <w:t xml:space="preserve">El sistema debe permitir </w:t>
+            </w:r>
+            <w:r>
+              <w:rPr>
+                <w:rStyle w:val="Textoennegrita"/>
+                <w:rFonts w:ascii="Arial" w:hAnsi="Arial" w:cs="Arial"/>
+                <w:b w:val="0"/>
+                <w:bCs w:val="0"/>
+              </w:rPr>
+              <w:t>mantener un historial de los cambios realizados sobre una solicitud</w:t>
+            </w:r>
+            <w:r>
+              <w:rPr>
+                <w:rFonts w:ascii="Arial" w:hAnsi="Arial" w:cs="Arial"/>
+              </w:rPr>
+              <w:t>.</w:t>
             </w:r>
           </w:p>
         </w:tc>
@@ -3559,7 +3604,7 @@
                 <w:rFonts w:ascii="Arial" w:hAnsi="Arial" w:cs="Arial"/>
                 <w:lang w:val="es-ES"/>
               </w:rPr>
-              <w:t>No funcional</w:t>
+              <w:t>Funcional</w:t>
             </w:r>
           </w:p>
         </w:tc>
@@ -3598,7 +3643,7 @@
                 <w:rFonts w:ascii="Arial" w:hAnsi="Arial" w:cs="Arial"/>
                 <w:lang w:val="es-ES"/>
               </w:rPr>
-              <w:t>Baja</w:t>
+              <w:t>Media</w:t>
             </w:r>
           </w:p>
         </w:tc>
@@ -3623,21 +3668,11 @@
                 <w:lang w:val="es-ES"/>
               </w:rPr>
             </w:pPr>
-          </w:p>
-          <w:p>
-            <w:pPr>
-              <w:jc w:val="center"/>
-              <w:rPr>
-                <w:rFonts w:ascii="Arial" w:hAnsi="Arial" w:cs="Arial"/>
-                <w:lang w:val="es-ES"/>
-              </w:rPr>
-            </w:pPr>
-            <w:r>
-              <w:rPr>
-                <w:rFonts w:ascii="Arial" w:hAnsi="Arial" w:cs="Arial"/>
-                <w:lang w:val="es-ES"/>
-              </w:rPr>
-              <w:t>Implementar alguna API que facilite este proceso.</w:t>
+            <w:r>
+              <w:rPr>
+                <w:rFonts w:ascii="Arial" w:hAnsi="Arial" w:cs="Arial"/>
+              </w:rPr>
+              <w:t>El sistema conserva los estados anteriores y permite consultar el historial de la solicitud.</w:t>
             </w:r>
           </w:p>
         </w:tc>
@@ -3673,21 +3708,12 @@
                 <w:lang w:val="es-ES"/>
               </w:rPr>
             </w:pPr>
-          </w:p>
-          <w:p>
-            <w:pPr>
-              <w:jc w:val="center"/>
-              <w:rPr>
-                <w:rFonts w:ascii="Arial" w:hAnsi="Arial" w:cs="Arial"/>
-                <w:lang w:val="es-ES"/>
-              </w:rPr>
-            </w:pPr>
-            <w:r>
-              <w:rPr>
-                <w:rFonts w:ascii="Arial" w:hAnsi="Arial" w:cs="Arial"/>
-                <w:lang w:val="es-ES"/>
-              </w:rPr>
-              <w:t>RNF-07</w:t>
+            <w:r>
+              <w:rPr>
+                <w:rFonts w:ascii="Arial" w:hAnsi="Arial" w:cs="Arial"/>
+                <w:lang w:val="es-ES"/>
+              </w:rPr>
+              <w:t>RF-21</w:t>
             </w:r>
           </w:p>
         </w:tc>
@@ -3706,9 +3732,23 @@
             <w:r>
               <w:rPr>
                 <w:rFonts w:ascii="Arial" w:hAnsi="Arial" w:cs="Arial"/>
-                <w:lang w:val="es-ES"/>
-              </w:rPr>
-              <w:t>El sistema debe tener implementada herramientas un poco más avanzadas.</w:t>
+              </w:rPr>
+              <w:t xml:space="preserve">El sistema debe permitir </w:t>
+            </w:r>
+            <w:r>
+              <w:rPr>
+                <w:rStyle w:val="Textoennegrita"/>
+                <w:rFonts w:ascii="Arial" w:hAnsi="Arial" w:cs="Arial"/>
+                <w:b w:val="0"/>
+                <w:bCs w:val="0"/>
+              </w:rPr>
+              <w:t>consultar una solicitud mediante su número identificador</w:t>
+            </w:r>
+            <w:r>
+              <w:rPr>
+                <w:rFonts w:ascii="Arial" w:hAnsi="Arial" w:cs="Arial"/>
+              </w:rPr>
+              <w:t>.</w:t>
             </w:r>
           </w:p>
         </w:tc>
@@ -3727,26 +3767,27 @@
           </w:p>
           <w:p>
             <w:pPr>
-              <w:rPr>
-                <w:rFonts w:ascii="Arial" w:hAnsi="Arial" w:cs="Arial"/>
-                <w:lang w:val="es-ES"/>
-              </w:rPr>
-            </w:pPr>
-          </w:p>
-          <w:p>
-            <w:pPr>
-              <w:jc w:val="center"/>
-              <w:rPr>
-                <w:rFonts w:ascii="Arial" w:hAnsi="Arial" w:cs="Arial"/>
-                <w:lang w:val="es-ES"/>
-              </w:rPr>
-            </w:pPr>
-            <w:r>
-              <w:rPr>
-                <w:rFonts w:ascii="Arial" w:hAnsi="Arial" w:cs="Arial"/>
-                <w:lang w:val="es-ES"/>
-              </w:rPr>
-              <w:t>No funcional</w:t>
+              <w:jc w:val="center"/>
+              <w:rPr>
+                <w:rFonts w:ascii="Arial" w:hAnsi="Arial" w:cs="Arial"/>
+                <w:lang w:val="es-ES"/>
+              </w:rPr>
+            </w:pPr>
+          </w:p>
+          <w:p>
+            <w:pPr>
+              <w:jc w:val="center"/>
+              <w:rPr>
+                <w:rFonts w:ascii="Arial" w:hAnsi="Arial" w:cs="Arial"/>
+                <w:lang w:val="es-ES"/>
+              </w:rPr>
+            </w:pPr>
+            <w:r>
+              <w:rPr>
+                <w:rFonts w:ascii="Arial" w:hAnsi="Arial" w:cs="Arial"/>
+                <w:lang w:val="es-ES"/>
+              </w:rPr>
+              <w:t>Funcional</w:t>
             </w:r>
           </w:p>
         </w:tc>
@@ -3798,57 +3839,31 @@
               <w:jc w:val="center"/>
               <w:rPr>
                 <w:rFonts w:ascii="Arial" w:hAnsi="Arial" w:cs="Arial"/>
-                <w:lang w:val="es-ES"/>
-              </w:rPr>
-            </w:pPr>
-          </w:p>
-          <w:p>
-            <w:pPr>
-              <w:jc w:val="center"/>
-              <w:rPr>
-                <w:rFonts w:ascii="Arial" w:hAnsi="Arial" w:cs="Arial"/>
-                <w:lang w:val="es-ES"/>
-              </w:rPr>
-            </w:pPr>
-            <w:r>
-              <w:rPr>
-                <w:rFonts w:ascii="Arial" w:hAnsi="Arial" w:cs="Arial"/>
-                <w:lang w:val="es-ES"/>
-              </w:rPr>
-              <w:t xml:space="preserve">Usar </w:t>
-            </w:r>
-            <w:proofErr w:type="spellStart"/>
-            <w:r>
-              <w:rPr>
-                <w:rFonts w:ascii="Arial" w:hAnsi="Arial" w:cs="Arial"/>
-                <w:lang w:val="es-ES"/>
-              </w:rPr>
-              <w:t>frameworks</w:t>
-            </w:r>
-            <w:proofErr w:type="spellEnd"/>
-            <w:r>
-              <w:rPr>
-                <w:rFonts w:ascii="Arial" w:hAnsi="Arial" w:cs="Arial"/>
-                <w:lang w:val="es-ES"/>
-              </w:rPr>
-              <w:t xml:space="preserve">, librerías, APIS, </w:t>
-            </w:r>
-            <w:proofErr w:type="spellStart"/>
-            <w:r>
-              <w:rPr>
-                <w:rFonts w:ascii="Arial" w:hAnsi="Arial" w:cs="Arial"/>
-                <w:lang w:val="es-ES"/>
-              </w:rPr>
-              <w:t>Saas</w:t>
-            </w:r>
-            <w:proofErr w:type="spellEnd"/>
-            <w:r>
-              <w:rPr>
-                <w:rFonts w:ascii="Arial" w:hAnsi="Arial" w:cs="Arial"/>
-                <w:lang w:val="es-ES"/>
-              </w:rPr>
-              <w:t xml:space="preserve"> u otras herramientas / técnicas avanzadas.</w:t>
-            </w:r>
+              </w:rPr>
+            </w:pPr>
+          </w:p>
+          <w:p>
+            <w:pPr>
+              <w:jc w:val="center"/>
+              <w:rPr>
+                <w:rFonts w:ascii="Arial" w:hAnsi="Arial" w:cs="Arial"/>
+                <w:lang w:val="es-ES"/>
+              </w:rPr>
+            </w:pPr>
+            <w:r>
+              <w:rPr>
+                <w:rFonts w:ascii="Arial" w:hAnsi="Arial" w:cs="Arial"/>
+              </w:rPr>
+              <w:t>Al ingresar un número válido, el sistema muestra la información correspondiente a la solicitud.</w:t>
+            </w:r>
+          </w:p>
+          <w:p>
+            <w:pPr>
+              <w:rPr>
+                <w:rFonts w:ascii="Arial" w:hAnsi="Arial" w:cs="Arial"/>
+                <w:lang w:val="es-ES"/>
+              </w:rPr>
+            </w:pPr>
           </w:p>
         </w:tc>
       </w:tr>
@@ -3866,6 +3881,22 @@
               </w:rPr>
             </w:pPr>
           </w:p>
+          <w:p>
+            <w:pPr>
+              <w:jc w:val="center"/>
+              <w:rPr>
+                <w:rFonts w:ascii="Arial" w:hAnsi="Arial" w:cs="Arial"/>
+                <w:lang w:val="es-ES"/>
+              </w:rPr>
+            </w:pPr>
+            <w:r>
+              <w:rPr>
+                <w:rFonts w:ascii="Arial" w:hAnsi="Arial" w:cs="Arial"/>
+                <w:lang w:val="es-ES"/>
+              </w:rPr>
+              <w:t>RF-22</w:t>
+            </w:r>
+          </w:p>
         </w:tc>
         <w:tc>
           <w:tcPr>
@@ -3879,6 +3910,12 @@
                 <w:lang w:val="es-ES"/>
               </w:rPr>
             </w:pPr>
+            <w:r>
+              <w:rPr>
+                <w:rFonts w:ascii="Arial" w:hAnsi="Arial" w:cs="Arial"/>
+              </w:rPr>
+              <w:t>El sistema debe permitir a los funcionarios filtrar solicitud por estado</w:t>
+            </w:r>
           </w:p>
         </w:tc>
         <w:tc>
@@ -3894,6 +3931,31 @@
               </w:rPr>
             </w:pPr>
           </w:p>
+          <w:p>
+            <w:pPr>
+              <w:jc w:val="center"/>
+              <w:rPr>
+                <w:rFonts w:ascii="Arial" w:hAnsi="Arial" w:cs="Arial"/>
+                <w:lang w:val="es-ES"/>
+              </w:rPr>
+            </w:pPr>
+          </w:p>
+          <w:p>
+            <w:pPr>
+              <w:jc w:val="center"/>
+              <w:rPr>
+                <w:rFonts w:ascii="Arial" w:hAnsi="Arial" w:cs="Arial"/>
+                <w:lang w:val="es-ES"/>
+              </w:rPr>
+            </w:pPr>
+            <w:r>
+              <w:rPr>
+                <w:rFonts w:ascii="Arial" w:hAnsi="Arial" w:cs="Arial"/>
+                <w:lang w:val="es-ES"/>
+              </w:rPr>
+              <w:t>Funcional</w:t>
+            </w:r>
+          </w:p>
         </w:tc>
         <w:tc>
           <w:tcPr>
@@ -3908,6 +3970,31 @@
               </w:rPr>
             </w:pPr>
           </w:p>
+          <w:p>
+            <w:pPr>
+              <w:jc w:val="center"/>
+              <w:rPr>
+                <w:rFonts w:ascii="Arial" w:hAnsi="Arial" w:cs="Arial"/>
+                <w:lang w:val="es-ES"/>
+              </w:rPr>
+            </w:pPr>
+          </w:p>
+          <w:p>
+            <w:pPr>
+              <w:jc w:val="center"/>
+              <w:rPr>
+                <w:rFonts w:ascii="Arial" w:hAnsi="Arial" w:cs="Arial"/>
+                <w:lang w:val="es-ES"/>
+              </w:rPr>
+            </w:pPr>
+            <w:r>
+              <w:rPr>
+                <w:rFonts w:ascii="Arial" w:hAnsi="Arial" w:cs="Arial"/>
+                <w:lang w:val="es-ES"/>
+              </w:rPr>
+              <w:t>Media</w:t>
+            </w:r>
+          </w:p>
         </w:tc>
         <w:tc>
           <w:tcPr>
@@ -3921,6 +4008,12 @@
                 <w:lang w:val="es-ES"/>
               </w:rPr>
             </w:pPr>
+            <w:r>
+              <w:rPr>
+                <w:rFonts w:ascii="Arial" w:hAnsi="Arial" w:cs="Arial"/>
+              </w:rPr>
+              <w:t>El funcionario puede visualizar únicamente las solicitudes que correspondan al estado seleccionado.</w:t>
+            </w:r>
           </w:p>
         </w:tc>
       </w:tr>
@@ -3938,6 +4031,40 @@
               </w:rPr>
             </w:pPr>
           </w:p>
+          <w:p>
+            <w:pPr>
+              <w:jc w:val="center"/>
+              <w:rPr>
+                <w:rFonts w:ascii="Arial" w:hAnsi="Arial" w:cs="Arial"/>
+                <w:lang w:val="es-ES"/>
+              </w:rPr>
+            </w:pPr>
+          </w:p>
+          <w:p>
+            <w:pPr>
+              <w:jc w:val="center"/>
+              <w:rPr>
+                <w:rFonts w:ascii="Arial" w:hAnsi="Arial" w:cs="Arial"/>
+                <w:lang w:val="es-ES"/>
+              </w:rPr>
+            </w:pPr>
+            <w:r>
+              <w:rPr>
+                <w:rFonts w:ascii="Arial" w:hAnsi="Arial" w:cs="Arial"/>
+                <w:lang w:val="es-ES"/>
+              </w:rPr>
+              <w:t>RNF-01</w:t>
+            </w:r>
+          </w:p>
+          <w:p>
+            <w:pPr>
+              <w:jc w:val="center"/>
+              <w:rPr>
+                <w:rFonts w:ascii="Arial" w:hAnsi="Arial" w:cs="Arial"/>
+                <w:lang w:val="es-ES"/>
+              </w:rPr>
+            </w:pPr>
+          </w:p>
         </w:tc>
         <w:tc>
           <w:tcPr>
@@ -3951,6 +4078,13 @@
                 <w:lang w:val="es-ES"/>
               </w:rPr>
             </w:pPr>
+            <w:r>
+              <w:rPr>
+                <w:rFonts w:ascii="Arial" w:hAnsi="Arial" w:cs="Arial"/>
+                <w:lang w:val="es-ES"/>
+              </w:rPr>
+              <w:t>La base de datos del sistema debe estar preparada para manejar bastante información.</w:t>
+            </w:r>
           </w:p>
         </w:tc>
         <w:tc>
@@ -3966,6 +4100,31 @@
               </w:rPr>
             </w:pPr>
           </w:p>
+          <w:p>
+            <w:pPr>
+              <w:jc w:val="center"/>
+              <w:rPr>
+                <w:rFonts w:ascii="Arial" w:hAnsi="Arial" w:cs="Arial"/>
+                <w:lang w:val="es-ES"/>
+              </w:rPr>
+            </w:pPr>
+          </w:p>
+          <w:p>
+            <w:pPr>
+              <w:jc w:val="center"/>
+              <w:rPr>
+                <w:rFonts w:ascii="Arial" w:hAnsi="Arial" w:cs="Arial"/>
+                <w:lang w:val="es-ES"/>
+              </w:rPr>
+            </w:pPr>
+            <w:r>
+              <w:rPr>
+                <w:rFonts w:ascii="Arial" w:hAnsi="Arial" w:cs="Arial"/>
+                <w:lang w:val="es-ES"/>
+              </w:rPr>
+              <w:t>No funcional</w:t>
+            </w:r>
+          </w:p>
         </w:tc>
         <w:tc>
           <w:tcPr>
@@ -3980,6 +4139,31 @@
               </w:rPr>
             </w:pPr>
           </w:p>
+          <w:p>
+            <w:pPr>
+              <w:jc w:val="center"/>
+              <w:rPr>
+                <w:rFonts w:ascii="Arial" w:hAnsi="Arial" w:cs="Arial"/>
+                <w:lang w:val="es-ES"/>
+              </w:rPr>
+            </w:pPr>
+          </w:p>
+          <w:p>
+            <w:pPr>
+              <w:jc w:val="center"/>
+              <w:rPr>
+                <w:rFonts w:ascii="Arial" w:hAnsi="Arial" w:cs="Arial"/>
+                <w:lang w:val="es-ES"/>
+              </w:rPr>
+            </w:pPr>
+            <w:r>
+              <w:rPr>
+                <w:rFonts w:ascii="Arial" w:hAnsi="Arial" w:cs="Arial"/>
+                <w:lang w:val="es-ES"/>
+              </w:rPr>
+              <w:t>Alta</w:t>
+            </w:r>
+          </w:p>
         </w:tc>
         <w:tc>
           <w:tcPr>
@@ -3993,6 +4177,22 @@
                 <w:lang w:val="es-ES"/>
               </w:rPr>
             </w:pPr>
+          </w:p>
+          <w:p>
+            <w:pPr>
+              <w:jc w:val="center"/>
+              <w:rPr>
+                <w:rFonts w:ascii="Arial" w:hAnsi="Arial" w:cs="Arial"/>
+                <w:lang w:val="es-ES"/>
+              </w:rPr>
+            </w:pPr>
+            <w:r>
+              <w:rPr>
+                <w:rFonts w:ascii="Arial" w:hAnsi="Arial" w:cs="Arial"/>
+                <w:lang w:val="es-ES"/>
+              </w:rPr>
+              <w:t>La base de datos debe estar creada con buenas prácticas de diseño e índices.</w:t>
+            </w:r>
           </w:p>
         </w:tc>
       </w:tr>
@@ -4010,6 +4210,40 @@
               </w:rPr>
             </w:pPr>
           </w:p>
+          <w:p>
+            <w:pPr>
+              <w:jc w:val="center"/>
+              <w:rPr>
+                <w:rFonts w:ascii="Arial" w:hAnsi="Arial" w:cs="Arial"/>
+                <w:lang w:val="es-ES"/>
+              </w:rPr>
+            </w:pPr>
+          </w:p>
+          <w:p>
+            <w:pPr>
+              <w:jc w:val="center"/>
+              <w:rPr>
+                <w:rFonts w:ascii="Arial" w:hAnsi="Arial" w:cs="Arial"/>
+                <w:lang w:val="es-ES"/>
+              </w:rPr>
+            </w:pPr>
+          </w:p>
+          <w:p>
+            <w:pPr>
+              <w:jc w:val="center"/>
+              <w:rPr>
+                <w:rFonts w:ascii="Arial" w:hAnsi="Arial" w:cs="Arial"/>
+                <w:lang w:val="es-ES"/>
+              </w:rPr>
+            </w:pPr>
+            <w:r>
+              <w:rPr>
+                <w:rFonts w:ascii="Arial" w:hAnsi="Arial" w:cs="Arial"/>
+                <w:lang w:val="es-ES"/>
+              </w:rPr>
+              <w:t>RNF-02</w:t>
+            </w:r>
+          </w:p>
         </w:tc>
         <w:tc>
           <w:tcPr>
@@ -4023,6 +4257,13 @@
                 <w:lang w:val="es-ES"/>
               </w:rPr>
             </w:pPr>
+            <w:r>
+              <w:rPr>
+                <w:rFonts w:ascii="Arial" w:hAnsi="Arial" w:cs="Arial"/>
+                <w:lang w:val="es-ES"/>
+              </w:rPr>
+              <w:t>Los certificados deben generarse en formato PDF, diseñada la plantilla por los creadores del proyecto.</w:t>
+            </w:r>
           </w:p>
         </w:tc>
         <w:tc>
@@ -4038,6 +4279,40 @@
               </w:rPr>
             </w:pPr>
           </w:p>
+          <w:p>
+            <w:pPr>
+              <w:jc w:val="center"/>
+              <w:rPr>
+                <w:rFonts w:ascii="Arial" w:hAnsi="Arial" w:cs="Arial"/>
+                <w:lang w:val="es-ES"/>
+              </w:rPr>
+            </w:pPr>
+          </w:p>
+          <w:p>
+            <w:pPr>
+              <w:jc w:val="center"/>
+              <w:rPr>
+                <w:rFonts w:ascii="Arial" w:hAnsi="Arial" w:cs="Arial"/>
+                <w:lang w:val="es-ES"/>
+              </w:rPr>
+            </w:pPr>
+          </w:p>
+          <w:p>
+            <w:pPr>
+              <w:jc w:val="center"/>
+              <w:rPr>
+                <w:rFonts w:ascii="Arial" w:hAnsi="Arial" w:cs="Arial"/>
+                <w:lang w:val="es-ES"/>
+              </w:rPr>
+            </w:pPr>
+            <w:r>
+              <w:rPr>
+                <w:rFonts w:ascii="Arial" w:hAnsi="Arial" w:cs="Arial"/>
+                <w:lang w:val="es-ES"/>
+              </w:rPr>
+              <w:t>No funcional</w:t>
+            </w:r>
+          </w:p>
         </w:tc>
         <w:tc>
           <w:tcPr>
@@ -4052,6 +4327,40 @@
               </w:rPr>
             </w:pPr>
           </w:p>
+          <w:p>
+            <w:pPr>
+              <w:jc w:val="center"/>
+              <w:rPr>
+                <w:rFonts w:ascii="Arial" w:hAnsi="Arial" w:cs="Arial"/>
+                <w:lang w:val="es-ES"/>
+              </w:rPr>
+            </w:pPr>
+          </w:p>
+          <w:p>
+            <w:pPr>
+              <w:jc w:val="center"/>
+              <w:rPr>
+                <w:rFonts w:ascii="Arial" w:hAnsi="Arial" w:cs="Arial"/>
+                <w:lang w:val="es-ES"/>
+              </w:rPr>
+            </w:pPr>
+          </w:p>
+          <w:p>
+            <w:pPr>
+              <w:jc w:val="center"/>
+              <w:rPr>
+                <w:rFonts w:ascii="Arial" w:hAnsi="Arial" w:cs="Arial"/>
+                <w:lang w:val="es-ES"/>
+              </w:rPr>
+            </w:pPr>
+            <w:r>
+              <w:rPr>
+                <w:rFonts w:ascii="Arial" w:hAnsi="Arial" w:cs="Arial"/>
+                <w:lang w:val="es-ES"/>
+              </w:rPr>
+              <w:t>Media</w:t>
+            </w:r>
+          </w:p>
         </w:tc>
         <w:tc>
           <w:tcPr>
@@ -4065,6 +4374,22 @@
                 <w:lang w:val="es-ES"/>
               </w:rPr>
             </w:pPr>
+          </w:p>
+          <w:p>
+            <w:pPr>
+              <w:jc w:val="center"/>
+              <w:rPr>
+                <w:rFonts w:ascii="Arial" w:hAnsi="Arial" w:cs="Arial"/>
+                <w:lang w:val="es-ES"/>
+              </w:rPr>
+            </w:pPr>
+            <w:r>
+              <w:rPr>
+                <w:rFonts w:ascii="Arial" w:hAnsi="Arial" w:cs="Arial"/>
+                <w:lang w:val="es-ES"/>
+              </w:rPr>
+              <w:t>Se debe usar alguna librería o servicio que facilite la generación del PDF, y el PDF ya debe estar diseñado su diseño.</w:t>
+            </w:r>
           </w:p>
         </w:tc>
       </w:tr>
@@ -4082,6 +4407,22 @@
               </w:rPr>
             </w:pPr>
           </w:p>
+          <w:p>
+            <w:pPr>
+              <w:jc w:val="center"/>
+              <w:rPr>
+                <w:rFonts w:ascii="Arial" w:hAnsi="Arial" w:cs="Arial"/>
+                <w:lang w:val="es-ES"/>
+              </w:rPr>
+            </w:pPr>
+            <w:r>
+              <w:rPr>
+                <w:rFonts w:ascii="Arial" w:hAnsi="Arial" w:cs="Arial"/>
+                <w:lang w:val="es-ES"/>
+              </w:rPr>
+              <w:t>RNF-03</w:t>
+            </w:r>
+          </w:p>
         </w:tc>
         <w:tc>
           <w:tcPr>
@@ -4095,6 +4436,29 @@
                 <w:lang w:val="es-ES"/>
               </w:rPr>
             </w:pPr>
+            <w:r>
+              <w:rPr>
+                <w:rFonts w:ascii="Arial" w:hAnsi="Arial" w:cs="Arial"/>
+                <w:lang w:val="es-ES"/>
+              </w:rPr>
+              <w:t xml:space="preserve">El sistema debe ser totalmente </w:t>
+            </w:r>
+            <w:proofErr w:type="spellStart"/>
+            <w:r>
+              <w:rPr>
+                <w:rFonts w:ascii="Arial" w:hAnsi="Arial" w:cs="Arial"/>
+                <w:lang w:val="es-ES"/>
+              </w:rPr>
+              <w:t>responsive</w:t>
+            </w:r>
+            <w:proofErr w:type="spellEnd"/>
+            <w:r>
+              <w:rPr>
+                <w:rFonts w:ascii="Arial" w:hAnsi="Arial" w:cs="Arial"/>
+                <w:lang w:val="es-ES"/>
+              </w:rPr>
+              <w:t>.</w:t>
+            </w:r>
           </w:p>
         </w:tc>
         <w:tc>
@@ -4110,6 +4474,31 @@
               </w:rPr>
             </w:pPr>
           </w:p>
+          <w:p>
+            <w:pPr>
+              <w:jc w:val="center"/>
+              <w:rPr>
+                <w:rFonts w:ascii="Arial" w:hAnsi="Arial" w:cs="Arial"/>
+                <w:lang w:val="es-ES"/>
+              </w:rPr>
+            </w:pPr>
+            <w:r>
+              <w:rPr>
+                <w:rFonts w:ascii="Arial" w:hAnsi="Arial" w:cs="Arial"/>
+                <w:lang w:val="es-ES"/>
+              </w:rPr>
+              <w:t>No funcional</w:t>
+            </w:r>
+          </w:p>
+          <w:p>
+            <w:pPr>
+              <w:jc w:val="center"/>
+              <w:rPr>
+                <w:rFonts w:ascii="Arial" w:hAnsi="Arial" w:cs="Arial"/>
+                <w:lang w:val="es-ES"/>
+              </w:rPr>
+            </w:pPr>
+          </w:p>
         </w:tc>
         <w:tc>
           <w:tcPr>
@@ -4124,6 +4513,22 @@
               </w:rPr>
             </w:pPr>
           </w:p>
+          <w:p>
+            <w:pPr>
+              <w:jc w:val="center"/>
+              <w:rPr>
+                <w:rFonts w:ascii="Arial" w:hAnsi="Arial" w:cs="Arial"/>
+                <w:lang w:val="es-ES"/>
+              </w:rPr>
+            </w:pPr>
+            <w:r>
+              <w:rPr>
+                <w:rFonts w:ascii="Arial" w:hAnsi="Arial" w:cs="Arial"/>
+                <w:lang w:val="es-ES"/>
+              </w:rPr>
+              <w:t>Alta</w:t>
+            </w:r>
+          </w:p>
         </w:tc>
         <w:tc>
           <w:tcPr>
@@ -4137,6 +4542,61 @@
                 <w:lang w:val="es-ES"/>
               </w:rPr>
             </w:pPr>
+            <w:r>
+              <w:rPr>
+                <w:rFonts w:ascii="Arial" w:hAnsi="Arial" w:cs="Arial"/>
+                <w:lang w:val="es-ES"/>
+              </w:rPr>
+              <w:t xml:space="preserve">Usar </w:t>
+            </w:r>
+            <w:proofErr w:type="spellStart"/>
+            <w:r>
+              <w:rPr>
+                <w:rFonts w:ascii="Arial" w:hAnsi="Arial" w:cs="Arial"/>
+                <w:lang w:val="es-ES"/>
+              </w:rPr>
+              <w:t>JQuerys</w:t>
+            </w:r>
+            <w:proofErr w:type="spellEnd"/>
+            <w:r>
+              <w:rPr>
+                <w:rFonts w:ascii="Arial" w:hAnsi="Arial" w:cs="Arial"/>
+                <w:lang w:val="es-ES"/>
+              </w:rPr>
+              <w:t xml:space="preserve">, </w:t>
+            </w:r>
+            <w:proofErr w:type="spellStart"/>
+            <w:r>
+              <w:rPr>
+                <w:rFonts w:ascii="Arial" w:hAnsi="Arial" w:cs="Arial"/>
+                <w:lang w:val="es-ES"/>
+              </w:rPr>
+              <w:t>grid</w:t>
+            </w:r>
+            <w:proofErr w:type="spellEnd"/>
+            <w:r>
+              <w:rPr>
+                <w:rFonts w:ascii="Arial" w:hAnsi="Arial" w:cs="Arial"/>
+                <w:lang w:val="es-ES"/>
+              </w:rPr>
+              <w:t xml:space="preserve"> o </w:t>
+            </w:r>
+            <w:proofErr w:type="spellStart"/>
+            <w:r>
+              <w:rPr>
+                <w:rFonts w:ascii="Arial" w:hAnsi="Arial" w:cs="Arial"/>
+                <w:lang w:val="es-ES"/>
+              </w:rPr>
+              <w:t>flexbox</w:t>
+            </w:r>
+            <w:proofErr w:type="spellEnd"/>
+            <w:r>
+              <w:rPr>
+                <w:rFonts w:ascii="Arial" w:hAnsi="Arial" w:cs="Arial"/>
+                <w:lang w:val="es-ES"/>
+              </w:rPr>
+              <w:t xml:space="preserve"> en el diseño de la web.</w:t>
+            </w:r>
           </w:p>
         </w:tc>
       </w:tr>
@@ -4154,6 +4614,31 @@
               </w:rPr>
             </w:pPr>
           </w:p>
+          <w:p>
+            <w:pPr>
+              <w:jc w:val="center"/>
+              <w:rPr>
+                <w:rFonts w:ascii="Arial" w:hAnsi="Arial" w:cs="Arial"/>
+                <w:lang w:val="es-ES"/>
+              </w:rPr>
+            </w:pPr>
+          </w:p>
+          <w:p>
+            <w:pPr>
+              <w:jc w:val="center"/>
+              <w:rPr>
+                <w:rFonts w:ascii="Arial" w:hAnsi="Arial" w:cs="Arial"/>
+                <w:lang w:val="es-ES"/>
+              </w:rPr>
+            </w:pPr>
+            <w:r>
+              <w:rPr>
+                <w:rFonts w:ascii="Arial" w:hAnsi="Arial" w:cs="Arial"/>
+                <w:lang w:val="es-ES"/>
+              </w:rPr>
+              <w:t>RNF-04</w:t>
+            </w:r>
+          </w:p>
         </w:tc>
         <w:tc>
           <w:tcPr>
@@ -4164,9 +4649,17 @@
               <w:jc w:val="center"/>
               <w:rPr>
                 <w:rFonts w:ascii="Arial" w:hAnsi="Arial" w:cs="Arial"/>
-                <w:lang w:val="es-ES"/>
-              </w:rPr>
-            </w:pPr>
+                <w:u w:val="single"/>
+                <w:lang w:val="es-ES"/>
+              </w:rPr>
+            </w:pPr>
+            <w:r>
+              <w:rPr>
+                <w:rFonts w:ascii="Arial" w:hAnsi="Arial" w:cs="Arial"/>
+                <w:lang w:val="es-ES"/>
+              </w:rPr>
+              <w:t>El sistema debe responder ante alguna solicitud u operación en un tiempo de 3 segundos.</w:t>
+            </w:r>
           </w:p>
         </w:tc>
         <w:tc>
@@ -4182,6 +4675,31 @@
               </w:rPr>
             </w:pPr>
           </w:p>
+          <w:p>
+            <w:pPr>
+              <w:jc w:val="center"/>
+              <w:rPr>
+                <w:rFonts w:ascii="Arial" w:hAnsi="Arial" w:cs="Arial"/>
+                <w:lang w:val="es-ES"/>
+              </w:rPr>
+            </w:pPr>
+          </w:p>
+          <w:p>
+            <w:pPr>
+              <w:jc w:val="center"/>
+              <w:rPr>
+                <w:rFonts w:ascii="Arial" w:hAnsi="Arial" w:cs="Arial"/>
+                <w:lang w:val="es-ES"/>
+              </w:rPr>
+            </w:pPr>
+            <w:r>
+              <w:rPr>
+                <w:rFonts w:ascii="Arial" w:hAnsi="Arial" w:cs="Arial"/>
+                <w:lang w:val="es-ES"/>
+              </w:rPr>
+              <w:t>No funcional</w:t>
+            </w:r>
+          </w:p>
         </w:tc>
         <w:tc>
           <w:tcPr>
@@ -4196,6 +4714,31 @@
               </w:rPr>
             </w:pPr>
           </w:p>
+          <w:p>
+            <w:pPr>
+              <w:jc w:val="center"/>
+              <w:rPr>
+                <w:rFonts w:ascii="Arial" w:hAnsi="Arial" w:cs="Arial"/>
+                <w:lang w:val="es-ES"/>
+              </w:rPr>
+            </w:pPr>
+          </w:p>
+          <w:p>
+            <w:pPr>
+              <w:jc w:val="center"/>
+              <w:rPr>
+                <w:rFonts w:ascii="Arial" w:hAnsi="Arial" w:cs="Arial"/>
+                <w:lang w:val="es-ES"/>
+              </w:rPr>
+            </w:pPr>
+            <w:r>
+              <w:rPr>
+                <w:rFonts w:ascii="Arial" w:hAnsi="Arial" w:cs="Arial"/>
+                <w:lang w:val="es-ES"/>
+              </w:rPr>
+              <w:t>Alta</w:t>
+            </w:r>
+          </w:p>
         </w:tc>
         <w:tc>
           <w:tcPr>
@@ -4209,6 +4752,22 @@
                 <w:lang w:val="es-ES"/>
               </w:rPr>
             </w:pPr>
+          </w:p>
+          <w:p>
+            <w:pPr>
+              <w:jc w:val="center"/>
+              <w:rPr>
+                <w:rFonts w:ascii="Arial" w:hAnsi="Arial" w:cs="Arial"/>
+                <w:lang w:val="es-ES"/>
+              </w:rPr>
+            </w:pPr>
+            <w:r>
+              <w:rPr>
+                <w:rFonts w:ascii="Arial" w:hAnsi="Arial" w:cs="Arial"/>
+                <w:lang w:val="es-ES"/>
+              </w:rPr>
+              <w:t>La base de datos del sistema debe tener las operaciones correctas y escritas de la mejor manera, usando buenas prácticas.</w:t>
+            </w:r>
           </w:p>
         </w:tc>
       </w:tr>
@@ -4226,6 +4785,22 @@
               </w:rPr>
             </w:pPr>
           </w:p>
+          <w:p>
+            <w:pPr>
+              <w:jc w:val="center"/>
+              <w:rPr>
+                <w:rFonts w:ascii="Arial" w:hAnsi="Arial" w:cs="Arial"/>
+                <w:lang w:val="es-ES"/>
+              </w:rPr>
+            </w:pPr>
+            <w:r>
+              <w:rPr>
+                <w:rFonts w:ascii="Arial" w:hAnsi="Arial" w:cs="Arial"/>
+                <w:lang w:val="es-ES"/>
+              </w:rPr>
+              <w:t>RNF-05</w:t>
+            </w:r>
+          </w:p>
         </w:tc>
         <w:tc>
           <w:tcPr>
@@ -4239,6 +4814,13 @@
                 <w:lang w:val="es-ES"/>
               </w:rPr>
             </w:pPr>
+            <w:r>
+              <w:rPr>
+                <w:rFonts w:ascii="Arial" w:hAnsi="Arial" w:cs="Arial"/>
+                <w:lang w:val="es-ES"/>
+              </w:rPr>
+              <w:t>La interfaz del sistema debe ser amigable y estéticamente bonita.</w:t>
+            </w:r>
           </w:p>
         </w:tc>
         <w:tc>
@@ -4254,6 +4836,31 @@
               </w:rPr>
             </w:pPr>
           </w:p>
+          <w:p>
+            <w:pPr>
+              <w:jc w:val="center"/>
+              <w:rPr>
+                <w:rFonts w:ascii="Arial" w:hAnsi="Arial" w:cs="Arial"/>
+                <w:lang w:val="es-ES"/>
+              </w:rPr>
+            </w:pPr>
+          </w:p>
+          <w:p>
+            <w:pPr>
+              <w:jc w:val="center"/>
+              <w:rPr>
+                <w:rFonts w:ascii="Arial" w:hAnsi="Arial" w:cs="Arial"/>
+                <w:lang w:val="es-ES"/>
+              </w:rPr>
+            </w:pPr>
+            <w:r>
+              <w:rPr>
+                <w:rFonts w:ascii="Arial" w:hAnsi="Arial" w:cs="Arial"/>
+                <w:lang w:val="es-ES"/>
+              </w:rPr>
+              <w:t>No funcional</w:t>
+            </w:r>
+          </w:p>
         </w:tc>
         <w:tc>
           <w:tcPr>
@@ -4268,6 +4875,31 @@
               </w:rPr>
             </w:pPr>
           </w:p>
+          <w:p>
+            <w:pPr>
+              <w:jc w:val="center"/>
+              <w:rPr>
+                <w:rFonts w:ascii="Arial" w:hAnsi="Arial" w:cs="Arial"/>
+                <w:lang w:val="es-ES"/>
+              </w:rPr>
+            </w:pPr>
+          </w:p>
+          <w:p>
+            <w:pPr>
+              <w:jc w:val="center"/>
+              <w:rPr>
+                <w:rFonts w:ascii="Arial" w:hAnsi="Arial" w:cs="Arial"/>
+                <w:lang w:val="es-ES"/>
+              </w:rPr>
+            </w:pPr>
+            <w:r>
+              <w:rPr>
+                <w:rFonts w:ascii="Arial" w:hAnsi="Arial" w:cs="Arial"/>
+                <w:lang w:val="es-ES"/>
+              </w:rPr>
+              <w:t>Media</w:t>
+            </w:r>
+          </w:p>
         </w:tc>
         <w:tc>
           <w:tcPr>
@@ -4281,6 +4913,22 @@
                 <w:lang w:val="es-ES"/>
               </w:rPr>
             </w:pPr>
+          </w:p>
+          <w:p>
+            <w:pPr>
+              <w:jc w:val="center"/>
+              <w:rPr>
+                <w:rFonts w:ascii="Arial" w:hAnsi="Arial" w:cs="Arial"/>
+                <w:lang w:val="es-ES"/>
+              </w:rPr>
+            </w:pPr>
+            <w:r>
+              <w:rPr>
+                <w:rFonts w:ascii="Arial" w:hAnsi="Arial" w:cs="Arial"/>
+                <w:lang w:val="es-ES"/>
+              </w:rPr>
+              <w:t>Respetando los colores del branding establecidos por los creadores del proyecto.</w:t>
+            </w:r>
           </w:p>
         </w:tc>
       </w:tr>
@@ -4298,6 +4946,31 @@
               </w:rPr>
             </w:pPr>
           </w:p>
+          <w:p>
+            <w:pPr>
+              <w:jc w:val="center"/>
+              <w:rPr>
+                <w:rFonts w:ascii="Arial" w:hAnsi="Arial" w:cs="Arial"/>
+                <w:lang w:val="es-ES"/>
+              </w:rPr>
+            </w:pPr>
+          </w:p>
+          <w:p>
+            <w:pPr>
+              <w:jc w:val="center"/>
+              <w:rPr>
+                <w:rFonts w:ascii="Arial" w:hAnsi="Arial" w:cs="Arial"/>
+                <w:lang w:val="es-ES"/>
+              </w:rPr>
+            </w:pPr>
+            <w:r>
+              <w:rPr>
+                <w:rFonts w:ascii="Arial" w:hAnsi="Arial" w:cs="Arial"/>
+                <w:lang w:val="es-ES"/>
+              </w:rPr>
+              <w:t>RNF-06</w:t>
+            </w:r>
+          </w:p>
         </w:tc>
         <w:tc>
           <w:tcPr>
@@ -4311,6 +4984,13 @@
                 <w:lang w:val="es-ES"/>
               </w:rPr>
             </w:pPr>
+            <w:r>
+              <w:rPr>
+                <w:rFonts w:ascii="Arial" w:hAnsi="Arial" w:cs="Arial"/>
+                <w:lang w:val="es-ES"/>
+              </w:rPr>
+              <w:t>Las contraseñas guardadas en la base de datos deben guardarse en formato hash.</w:t>
+            </w:r>
           </w:p>
         </w:tc>
         <w:tc>
@@ -4326,6 +5006,31 @@
               </w:rPr>
             </w:pPr>
           </w:p>
+          <w:p>
+            <w:pPr>
+              <w:jc w:val="center"/>
+              <w:rPr>
+                <w:rFonts w:ascii="Arial" w:hAnsi="Arial" w:cs="Arial"/>
+                <w:lang w:val="es-ES"/>
+              </w:rPr>
+            </w:pPr>
+          </w:p>
+          <w:p>
+            <w:pPr>
+              <w:jc w:val="center"/>
+              <w:rPr>
+                <w:rFonts w:ascii="Arial" w:hAnsi="Arial" w:cs="Arial"/>
+                <w:lang w:val="es-ES"/>
+              </w:rPr>
+            </w:pPr>
+            <w:r>
+              <w:rPr>
+                <w:rFonts w:ascii="Arial" w:hAnsi="Arial" w:cs="Arial"/>
+                <w:lang w:val="es-ES"/>
+              </w:rPr>
+              <w:t>No funcional</w:t>
+            </w:r>
+          </w:p>
         </w:tc>
         <w:tc>
           <w:tcPr>
@@ -4340,6 +5045,31 @@
               </w:rPr>
             </w:pPr>
           </w:p>
+          <w:p>
+            <w:pPr>
+              <w:jc w:val="center"/>
+              <w:rPr>
+                <w:rFonts w:ascii="Arial" w:hAnsi="Arial" w:cs="Arial"/>
+                <w:lang w:val="es-ES"/>
+              </w:rPr>
+            </w:pPr>
+          </w:p>
+          <w:p>
+            <w:pPr>
+              <w:jc w:val="center"/>
+              <w:rPr>
+                <w:rFonts w:ascii="Arial" w:hAnsi="Arial" w:cs="Arial"/>
+                <w:lang w:val="es-ES"/>
+              </w:rPr>
+            </w:pPr>
+            <w:r>
+              <w:rPr>
+                <w:rFonts w:ascii="Arial" w:hAnsi="Arial" w:cs="Arial"/>
+                <w:lang w:val="es-ES"/>
+              </w:rPr>
+              <w:t>Baja</w:t>
+            </w:r>
+          </w:p>
         </w:tc>
         <w:tc>
           <w:tcPr>
@@ -4353,6 +5083,31 @@
                 <w:lang w:val="es-ES"/>
               </w:rPr>
             </w:pPr>
+          </w:p>
+          <w:p>
+            <w:pPr>
+              <w:jc w:val="center"/>
+              <w:rPr>
+                <w:rFonts w:ascii="Arial" w:hAnsi="Arial" w:cs="Arial"/>
+                <w:lang w:val="es-ES"/>
+              </w:rPr>
+            </w:pPr>
+          </w:p>
+          <w:p>
+            <w:pPr>
+              <w:jc w:val="center"/>
+              <w:rPr>
+                <w:rFonts w:ascii="Arial" w:hAnsi="Arial" w:cs="Arial"/>
+                <w:lang w:val="es-ES"/>
+              </w:rPr>
+            </w:pPr>
+            <w:r>
+              <w:rPr>
+                <w:rFonts w:ascii="Arial" w:hAnsi="Arial" w:cs="Arial"/>
+                <w:lang w:val="es-ES"/>
+              </w:rPr>
+              <w:t>Implementar alguna API que facilite este proceso.</w:t>
+            </w:r>
           </w:p>
         </w:tc>
       </w:tr>
@@ -4370,6 +5125,40 @@
               </w:rPr>
             </w:pPr>
           </w:p>
+          <w:p>
+            <w:pPr>
+              <w:jc w:val="center"/>
+              <w:rPr>
+                <w:rFonts w:ascii="Arial" w:hAnsi="Arial" w:cs="Arial"/>
+                <w:lang w:val="es-ES"/>
+              </w:rPr>
+            </w:pPr>
+          </w:p>
+          <w:p>
+            <w:pPr>
+              <w:jc w:val="center"/>
+              <w:rPr>
+                <w:rFonts w:ascii="Arial" w:hAnsi="Arial" w:cs="Arial"/>
+                <w:lang w:val="es-ES"/>
+              </w:rPr>
+            </w:pPr>
+          </w:p>
+          <w:p>
+            <w:pPr>
+              <w:jc w:val="center"/>
+              <w:rPr>
+                <w:rFonts w:ascii="Arial" w:hAnsi="Arial" w:cs="Arial"/>
+                <w:lang w:val="es-ES"/>
+              </w:rPr>
+            </w:pPr>
+            <w:r>
+              <w:rPr>
+                <w:rFonts w:ascii="Arial" w:hAnsi="Arial" w:cs="Arial"/>
+                <w:lang w:val="es-ES"/>
+              </w:rPr>
+              <w:t>RNF-07</w:t>
+            </w:r>
+          </w:p>
         </w:tc>
         <w:tc>
           <w:tcPr>
@@ -4383,6 +5172,13 @@
                 <w:lang w:val="es-ES"/>
               </w:rPr>
             </w:pPr>
+            <w:r>
+              <w:rPr>
+                <w:rFonts w:ascii="Arial" w:hAnsi="Arial" w:cs="Arial"/>
+                <w:lang w:val="es-ES"/>
+              </w:rPr>
+              <w:t>El sistema debe tener implementada herramientas un poco más avanzadas.</w:t>
+            </w:r>
           </w:p>
         </w:tc>
         <w:tc>
@@ -4398,6 +5194,31 @@
               </w:rPr>
             </w:pPr>
           </w:p>
+          <w:p>
+            <w:pPr>
+              <w:jc w:val="center"/>
+              <w:rPr>
+                <w:rFonts w:ascii="Arial" w:hAnsi="Arial" w:cs="Arial"/>
+                <w:lang w:val="es-ES"/>
+              </w:rPr>
+            </w:pPr>
+          </w:p>
+          <w:p>
+            <w:pPr>
+              <w:jc w:val="center"/>
+              <w:rPr>
+                <w:rFonts w:ascii="Arial" w:hAnsi="Arial" w:cs="Arial"/>
+                <w:lang w:val="es-ES"/>
+              </w:rPr>
+            </w:pPr>
+            <w:r>
+              <w:rPr>
+                <w:rFonts w:ascii="Arial" w:hAnsi="Arial" w:cs="Arial"/>
+                <w:lang w:val="es-ES"/>
+              </w:rPr>
+              <w:t>No funcional</w:t>
+            </w:r>
+          </w:p>
         </w:tc>
         <w:tc>
           <w:tcPr>
@@ -4412,6 +5233,31 @@
               </w:rPr>
             </w:pPr>
           </w:p>
+          <w:p>
+            <w:pPr>
+              <w:jc w:val="center"/>
+              <w:rPr>
+                <w:rFonts w:ascii="Arial" w:hAnsi="Arial" w:cs="Arial"/>
+                <w:lang w:val="es-ES"/>
+              </w:rPr>
+            </w:pPr>
+          </w:p>
+          <w:p>
+            <w:pPr>
+              <w:jc w:val="center"/>
+              <w:rPr>
+                <w:rFonts w:ascii="Arial" w:hAnsi="Arial" w:cs="Arial"/>
+                <w:lang w:val="es-ES"/>
+              </w:rPr>
+            </w:pPr>
+            <w:r>
+              <w:rPr>
+                <w:rFonts w:ascii="Arial" w:hAnsi="Arial" w:cs="Arial"/>
+                <w:lang w:val="es-ES"/>
+              </w:rPr>
+              <w:t>Media</w:t>
+            </w:r>
+          </w:p>
         </w:tc>
         <w:tc>
           <w:tcPr>
@@ -4426,1960 +5272,67 @@
               </w:rPr>
             </w:pPr>
           </w:p>
-        </w:tc>
-      </w:tr>
-      <w:tr>
-        <w:tc>
-          <w:tcPr>
-            <w:tcW w:w="1617" w:type="dxa"/>
-          </w:tcPr>
-          <w:p>
-            <w:pPr>
-              <w:jc w:val="center"/>
-              <w:rPr>
-                <w:rFonts w:ascii="Arial" w:hAnsi="Arial" w:cs="Arial"/>
-                <w:lang w:val="es-ES"/>
-              </w:rPr>
-            </w:pPr>
-          </w:p>
-        </w:tc>
-        <w:tc>
-          <w:tcPr>
-            <w:tcW w:w="2074" w:type="dxa"/>
-          </w:tcPr>
-          <w:p>
-            <w:pPr>
-              <w:jc w:val="center"/>
-              <w:rPr>
-                <w:rFonts w:ascii="Arial" w:hAnsi="Arial" w:cs="Arial"/>
-                <w:lang w:val="es-ES"/>
-              </w:rPr>
-            </w:pPr>
-          </w:p>
-        </w:tc>
-        <w:tc>
-          <w:tcPr>
-            <w:tcW w:w="1651" w:type="dxa"/>
-          </w:tcPr>
-          <w:p>
-            <w:pPr>
-              <w:jc w:val="center"/>
-              <w:rPr>
-                <w:rFonts w:ascii="Arial" w:hAnsi="Arial" w:cs="Arial"/>
-                <w:lang w:val="es-ES"/>
-              </w:rPr>
-            </w:pPr>
-          </w:p>
-        </w:tc>
-        <w:tc>
-          <w:tcPr>
-            <w:tcW w:w="1731" w:type="dxa"/>
-          </w:tcPr>
-          <w:p>
-            <w:pPr>
-              <w:jc w:val="center"/>
-              <w:rPr>
-                <w:rFonts w:ascii="Arial" w:hAnsi="Arial" w:cs="Arial"/>
-                <w:lang w:val="es-ES"/>
-              </w:rPr>
-            </w:pPr>
-          </w:p>
-        </w:tc>
-        <w:tc>
-          <w:tcPr>
-            <w:tcW w:w="3270" w:type="dxa"/>
-          </w:tcPr>
-          <w:p>
-            <w:pPr>
-              <w:jc w:val="center"/>
-              <w:rPr>
-                <w:rFonts w:ascii="Arial" w:hAnsi="Arial" w:cs="Arial"/>
-                <w:lang w:val="es-ES"/>
-              </w:rPr>
-            </w:pPr>
-          </w:p>
-        </w:tc>
-      </w:tr>
-      <w:tr>
-        <w:tc>
-          <w:tcPr>
-            <w:tcW w:w="1617" w:type="dxa"/>
-          </w:tcPr>
-          <w:p>
-            <w:pPr>
-              <w:jc w:val="center"/>
-              <w:rPr>
-                <w:rFonts w:ascii="Arial" w:hAnsi="Arial" w:cs="Arial"/>
-                <w:lang w:val="es-ES"/>
-              </w:rPr>
-            </w:pPr>
-          </w:p>
-        </w:tc>
-        <w:tc>
-          <w:tcPr>
-            <w:tcW w:w="2074" w:type="dxa"/>
-          </w:tcPr>
-          <w:p>
-            <w:pPr>
-              <w:jc w:val="center"/>
-              <w:rPr>
-                <w:rFonts w:ascii="Arial" w:hAnsi="Arial" w:cs="Arial"/>
-                <w:lang w:val="es-ES"/>
-              </w:rPr>
-            </w:pPr>
-          </w:p>
-        </w:tc>
-        <w:tc>
-          <w:tcPr>
-            <w:tcW w:w="1651" w:type="dxa"/>
-          </w:tcPr>
-          <w:p>
-            <w:pPr>
-              <w:jc w:val="center"/>
-              <w:rPr>
-                <w:rFonts w:ascii="Arial" w:hAnsi="Arial" w:cs="Arial"/>
-                <w:lang w:val="es-ES"/>
-              </w:rPr>
-            </w:pPr>
-          </w:p>
-        </w:tc>
-        <w:tc>
-          <w:tcPr>
-            <w:tcW w:w="1731" w:type="dxa"/>
-          </w:tcPr>
-          <w:p>
-            <w:pPr>
-              <w:jc w:val="center"/>
-              <w:rPr>
-                <w:rFonts w:ascii="Arial" w:hAnsi="Arial" w:cs="Arial"/>
-                <w:lang w:val="es-ES"/>
-              </w:rPr>
-            </w:pPr>
-          </w:p>
-        </w:tc>
-        <w:tc>
-          <w:tcPr>
-            <w:tcW w:w="3270" w:type="dxa"/>
-          </w:tcPr>
-          <w:p>
-            <w:pPr>
-              <w:jc w:val="center"/>
-              <w:rPr>
-                <w:rFonts w:ascii="Arial" w:hAnsi="Arial" w:cs="Arial"/>
-                <w:lang w:val="es-ES"/>
-              </w:rPr>
-            </w:pPr>
-          </w:p>
-        </w:tc>
-      </w:tr>
-      <w:tr>
-        <w:tc>
-          <w:tcPr>
-            <w:tcW w:w="1617" w:type="dxa"/>
-          </w:tcPr>
-          <w:p>
-            <w:pPr>
-              <w:jc w:val="center"/>
-              <w:rPr>
-                <w:rFonts w:ascii="Arial" w:hAnsi="Arial" w:cs="Arial"/>
-                <w:lang w:val="es-ES"/>
-              </w:rPr>
-            </w:pPr>
-          </w:p>
-        </w:tc>
-        <w:tc>
-          <w:tcPr>
-            <w:tcW w:w="2074" w:type="dxa"/>
-          </w:tcPr>
-          <w:p>
-            <w:pPr>
-              <w:jc w:val="center"/>
-              <w:rPr>
-                <w:rFonts w:ascii="Arial" w:hAnsi="Arial" w:cs="Arial"/>
-                <w:lang w:val="es-ES"/>
-              </w:rPr>
-            </w:pPr>
-          </w:p>
-        </w:tc>
-        <w:tc>
-          <w:tcPr>
-            <w:tcW w:w="1651" w:type="dxa"/>
-          </w:tcPr>
-          <w:p>
-            <w:pPr>
-              <w:jc w:val="center"/>
-              <w:rPr>
-                <w:rFonts w:ascii="Arial" w:hAnsi="Arial" w:cs="Arial"/>
-                <w:lang w:val="es-ES"/>
-              </w:rPr>
-            </w:pPr>
-          </w:p>
-        </w:tc>
-        <w:tc>
-          <w:tcPr>
-            <w:tcW w:w="1731" w:type="dxa"/>
-          </w:tcPr>
-          <w:p>
-            <w:pPr>
-              <w:jc w:val="center"/>
-              <w:rPr>
-                <w:rFonts w:ascii="Arial" w:hAnsi="Arial" w:cs="Arial"/>
-                <w:lang w:val="es-ES"/>
-              </w:rPr>
-            </w:pPr>
-          </w:p>
-        </w:tc>
-        <w:tc>
-          <w:tcPr>
-            <w:tcW w:w="3270" w:type="dxa"/>
-          </w:tcPr>
-          <w:p>
-            <w:pPr>
-              <w:jc w:val="center"/>
-              <w:rPr>
-                <w:rFonts w:ascii="Arial" w:hAnsi="Arial" w:cs="Arial"/>
-                <w:lang w:val="es-ES"/>
-              </w:rPr>
-            </w:pPr>
-          </w:p>
-        </w:tc>
-      </w:tr>
-      <w:tr>
-        <w:tc>
-          <w:tcPr>
-            <w:tcW w:w="1617" w:type="dxa"/>
-          </w:tcPr>
-          <w:p>
-            <w:pPr>
-              <w:jc w:val="center"/>
-              <w:rPr>
-                <w:rFonts w:ascii="Arial" w:hAnsi="Arial" w:cs="Arial"/>
-                <w:lang w:val="es-ES"/>
-              </w:rPr>
-            </w:pPr>
-          </w:p>
-        </w:tc>
-        <w:tc>
-          <w:tcPr>
-            <w:tcW w:w="2074" w:type="dxa"/>
-          </w:tcPr>
-          <w:p>
-            <w:pPr>
-              <w:jc w:val="center"/>
-              <w:rPr>
-                <w:rFonts w:ascii="Arial" w:hAnsi="Arial" w:cs="Arial"/>
-                <w:lang w:val="es-ES"/>
-              </w:rPr>
-            </w:pPr>
-          </w:p>
-        </w:tc>
-        <w:tc>
-          <w:tcPr>
-            <w:tcW w:w="1651" w:type="dxa"/>
-          </w:tcPr>
-          <w:p>
-            <w:pPr>
-              <w:jc w:val="center"/>
-              <w:rPr>
-                <w:rFonts w:ascii="Arial" w:hAnsi="Arial" w:cs="Arial"/>
-                <w:lang w:val="es-ES"/>
-              </w:rPr>
-            </w:pPr>
-          </w:p>
-        </w:tc>
-        <w:tc>
-          <w:tcPr>
-            <w:tcW w:w="1731" w:type="dxa"/>
-          </w:tcPr>
-          <w:p>
-            <w:pPr>
-              <w:jc w:val="center"/>
-              <w:rPr>
-                <w:rFonts w:ascii="Arial" w:hAnsi="Arial" w:cs="Arial"/>
-                <w:lang w:val="es-ES"/>
-              </w:rPr>
-            </w:pPr>
-          </w:p>
-        </w:tc>
-        <w:tc>
-          <w:tcPr>
-            <w:tcW w:w="3270" w:type="dxa"/>
-          </w:tcPr>
-          <w:p>
-            <w:pPr>
-              <w:jc w:val="center"/>
-              <w:rPr>
-                <w:rFonts w:ascii="Arial" w:hAnsi="Arial" w:cs="Arial"/>
-                <w:lang w:val="es-ES"/>
-              </w:rPr>
-            </w:pPr>
-          </w:p>
-        </w:tc>
-      </w:tr>
-      <w:tr>
-        <w:tc>
-          <w:tcPr>
-            <w:tcW w:w="1617" w:type="dxa"/>
-          </w:tcPr>
-          <w:p>
-            <w:pPr>
-              <w:jc w:val="center"/>
-              <w:rPr>
-                <w:rFonts w:ascii="Arial" w:hAnsi="Arial" w:cs="Arial"/>
-                <w:lang w:val="es-ES"/>
-              </w:rPr>
-            </w:pPr>
-          </w:p>
-        </w:tc>
-        <w:tc>
-          <w:tcPr>
-            <w:tcW w:w="2074" w:type="dxa"/>
-          </w:tcPr>
-          <w:p>
-            <w:pPr>
-              <w:jc w:val="center"/>
-              <w:rPr>
-                <w:rFonts w:ascii="Arial" w:hAnsi="Arial" w:cs="Arial"/>
-                <w:lang w:val="es-ES"/>
-              </w:rPr>
-            </w:pPr>
-          </w:p>
-        </w:tc>
-        <w:tc>
-          <w:tcPr>
-            <w:tcW w:w="1651" w:type="dxa"/>
-          </w:tcPr>
-          <w:p>
-            <w:pPr>
-              <w:jc w:val="center"/>
-              <w:rPr>
-                <w:rFonts w:ascii="Arial" w:hAnsi="Arial" w:cs="Arial"/>
-                <w:lang w:val="es-ES"/>
-              </w:rPr>
-            </w:pPr>
-          </w:p>
-        </w:tc>
-        <w:tc>
-          <w:tcPr>
-            <w:tcW w:w="1731" w:type="dxa"/>
-          </w:tcPr>
-          <w:p>
-            <w:pPr>
-              <w:jc w:val="center"/>
-              <w:rPr>
-                <w:rFonts w:ascii="Arial" w:hAnsi="Arial" w:cs="Arial"/>
-                <w:lang w:val="es-ES"/>
-              </w:rPr>
-            </w:pPr>
-          </w:p>
-        </w:tc>
-        <w:tc>
-          <w:tcPr>
-            <w:tcW w:w="3270" w:type="dxa"/>
-          </w:tcPr>
-          <w:p>
-            <w:pPr>
-              <w:jc w:val="center"/>
-              <w:rPr>
-                <w:rFonts w:ascii="Arial" w:hAnsi="Arial" w:cs="Arial"/>
-                <w:lang w:val="es-ES"/>
-              </w:rPr>
-            </w:pPr>
-          </w:p>
-        </w:tc>
-      </w:tr>
-      <w:tr>
-        <w:tc>
-          <w:tcPr>
-            <w:tcW w:w="1617" w:type="dxa"/>
-          </w:tcPr>
-          <w:p>
-            <w:pPr>
-              <w:jc w:val="center"/>
-              <w:rPr>
-                <w:rFonts w:ascii="Arial" w:hAnsi="Arial" w:cs="Arial"/>
-                <w:lang w:val="es-ES"/>
-              </w:rPr>
-            </w:pPr>
-          </w:p>
-        </w:tc>
-        <w:tc>
-          <w:tcPr>
-            <w:tcW w:w="2074" w:type="dxa"/>
-          </w:tcPr>
-          <w:p>
-            <w:pPr>
-              <w:jc w:val="center"/>
-              <w:rPr>
-                <w:rFonts w:ascii="Arial" w:hAnsi="Arial" w:cs="Arial"/>
-                <w:lang w:val="es-ES"/>
-              </w:rPr>
-            </w:pPr>
-          </w:p>
-        </w:tc>
-        <w:tc>
-          <w:tcPr>
-            <w:tcW w:w="1651" w:type="dxa"/>
-          </w:tcPr>
-          <w:p>
-            <w:pPr>
-              <w:jc w:val="center"/>
-              <w:rPr>
-                <w:rFonts w:ascii="Arial" w:hAnsi="Arial" w:cs="Arial"/>
-                <w:lang w:val="es-ES"/>
-              </w:rPr>
-            </w:pPr>
-          </w:p>
-        </w:tc>
-        <w:tc>
-          <w:tcPr>
-            <w:tcW w:w="1731" w:type="dxa"/>
-          </w:tcPr>
-          <w:p>
-            <w:pPr>
-              <w:jc w:val="center"/>
-              <w:rPr>
-                <w:rFonts w:ascii="Arial" w:hAnsi="Arial" w:cs="Arial"/>
-                <w:lang w:val="es-ES"/>
-              </w:rPr>
-            </w:pPr>
-          </w:p>
-        </w:tc>
-        <w:tc>
-          <w:tcPr>
-            <w:tcW w:w="3270" w:type="dxa"/>
-          </w:tcPr>
-          <w:p>
-            <w:pPr>
-              <w:jc w:val="center"/>
-              <w:rPr>
-                <w:rFonts w:ascii="Arial" w:hAnsi="Arial" w:cs="Arial"/>
-                <w:lang w:val="es-ES"/>
-              </w:rPr>
-            </w:pPr>
-          </w:p>
-        </w:tc>
-      </w:tr>
-      <w:tr>
-        <w:tc>
-          <w:tcPr>
-            <w:tcW w:w="1617" w:type="dxa"/>
-          </w:tcPr>
-          <w:p>
-            <w:pPr>
-              <w:jc w:val="center"/>
-              <w:rPr>
-                <w:rFonts w:ascii="Arial" w:hAnsi="Arial" w:cs="Arial"/>
-                <w:lang w:val="es-ES"/>
-              </w:rPr>
-            </w:pPr>
-          </w:p>
-        </w:tc>
-        <w:tc>
-          <w:tcPr>
-            <w:tcW w:w="2074" w:type="dxa"/>
-          </w:tcPr>
-          <w:p>
-            <w:pPr>
-              <w:jc w:val="center"/>
-              <w:rPr>
-                <w:rFonts w:ascii="Arial" w:hAnsi="Arial" w:cs="Arial"/>
-                <w:lang w:val="es-ES"/>
-              </w:rPr>
-            </w:pPr>
-          </w:p>
-        </w:tc>
-        <w:tc>
-          <w:tcPr>
-            <w:tcW w:w="1651" w:type="dxa"/>
-          </w:tcPr>
-          <w:p>
-            <w:pPr>
-              <w:jc w:val="center"/>
-              <w:rPr>
-                <w:rFonts w:ascii="Arial" w:hAnsi="Arial" w:cs="Arial"/>
-                <w:lang w:val="es-ES"/>
-              </w:rPr>
-            </w:pPr>
-          </w:p>
-        </w:tc>
-        <w:tc>
-          <w:tcPr>
-            <w:tcW w:w="1731" w:type="dxa"/>
-          </w:tcPr>
-          <w:p>
-            <w:pPr>
-              <w:jc w:val="center"/>
-              <w:rPr>
-                <w:rFonts w:ascii="Arial" w:hAnsi="Arial" w:cs="Arial"/>
-                <w:lang w:val="es-ES"/>
-              </w:rPr>
-            </w:pPr>
-          </w:p>
-        </w:tc>
-        <w:tc>
-          <w:tcPr>
-            <w:tcW w:w="3270" w:type="dxa"/>
-          </w:tcPr>
-          <w:p>
-            <w:pPr>
-              <w:jc w:val="center"/>
-              <w:rPr>
-                <w:rFonts w:ascii="Arial" w:hAnsi="Arial" w:cs="Arial"/>
-                <w:lang w:val="es-ES"/>
-              </w:rPr>
-            </w:pPr>
-          </w:p>
-        </w:tc>
-      </w:tr>
-      <w:tr>
-        <w:tc>
-          <w:tcPr>
-            <w:tcW w:w="1617" w:type="dxa"/>
-          </w:tcPr>
-          <w:p>
-            <w:pPr>
-              <w:jc w:val="center"/>
-              <w:rPr>
-                <w:rFonts w:ascii="Arial" w:hAnsi="Arial" w:cs="Arial"/>
-                <w:lang w:val="es-ES"/>
-              </w:rPr>
-            </w:pPr>
-          </w:p>
-        </w:tc>
-        <w:tc>
-          <w:tcPr>
-            <w:tcW w:w="2074" w:type="dxa"/>
-          </w:tcPr>
-          <w:p>
-            <w:pPr>
-              <w:jc w:val="center"/>
-              <w:rPr>
-                <w:rFonts w:ascii="Arial" w:hAnsi="Arial" w:cs="Arial"/>
-                <w:lang w:val="es-ES"/>
-              </w:rPr>
-            </w:pPr>
-          </w:p>
-        </w:tc>
-        <w:tc>
-          <w:tcPr>
-            <w:tcW w:w="1651" w:type="dxa"/>
-          </w:tcPr>
-          <w:p>
-            <w:pPr>
-              <w:jc w:val="center"/>
-              <w:rPr>
-                <w:rFonts w:ascii="Arial" w:hAnsi="Arial" w:cs="Arial"/>
-                <w:lang w:val="es-ES"/>
-              </w:rPr>
-            </w:pPr>
-          </w:p>
-        </w:tc>
-        <w:tc>
-          <w:tcPr>
-            <w:tcW w:w="1731" w:type="dxa"/>
-          </w:tcPr>
-          <w:p>
-            <w:pPr>
-              <w:jc w:val="center"/>
-              <w:rPr>
-                <w:rFonts w:ascii="Arial" w:hAnsi="Arial" w:cs="Arial"/>
-                <w:lang w:val="es-ES"/>
-              </w:rPr>
-            </w:pPr>
-          </w:p>
-        </w:tc>
-        <w:tc>
-          <w:tcPr>
-            <w:tcW w:w="3270" w:type="dxa"/>
-          </w:tcPr>
-          <w:p>
-            <w:pPr>
-              <w:jc w:val="center"/>
-              <w:rPr>
-                <w:rFonts w:ascii="Arial" w:hAnsi="Arial" w:cs="Arial"/>
-                <w:lang w:val="es-ES"/>
-              </w:rPr>
-            </w:pPr>
-          </w:p>
-        </w:tc>
-      </w:tr>
-      <w:tr>
-        <w:tc>
-          <w:tcPr>
-            <w:tcW w:w="1617" w:type="dxa"/>
-          </w:tcPr>
-          <w:p>
-            <w:pPr>
-              <w:jc w:val="center"/>
-              <w:rPr>
-                <w:rFonts w:ascii="Arial" w:hAnsi="Arial" w:cs="Arial"/>
-                <w:lang w:val="es-ES"/>
-              </w:rPr>
-            </w:pPr>
-          </w:p>
-        </w:tc>
-        <w:tc>
-          <w:tcPr>
-            <w:tcW w:w="2074" w:type="dxa"/>
-          </w:tcPr>
-          <w:p>
-            <w:pPr>
-              <w:jc w:val="center"/>
-              <w:rPr>
-                <w:rFonts w:ascii="Arial" w:hAnsi="Arial" w:cs="Arial"/>
-                <w:lang w:val="es-ES"/>
-              </w:rPr>
-            </w:pPr>
-          </w:p>
-        </w:tc>
-        <w:tc>
-          <w:tcPr>
-            <w:tcW w:w="1651" w:type="dxa"/>
-          </w:tcPr>
-          <w:p>
-            <w:pPr>
-              <w:jc w:val="center"/>
-              <w:rPr>
-                <w:rFonts w:ascii="Arial" w:hAnsi="Arial" w:cs="Arial"/>
-                <w:lang w:val="es-ES"/>
-              </w:rPr>
-            </w:pPr>
-          </w:p>
-        </w:tc>
-        <w:tc>
-          <w:tcPr>
-            <w:tcW w:w="1731" w:type="dxa"/>
-          </w:tcPr>
-          <w:p>
-            <w:pPr>
-              <w:jc w:val="center"/>
-              <w:rPr>
-                <w:rFonts w:ascii="Arial" w:hAnsi="Arial" w:cs="Arial"/>
-                <w:lang w:val="es-ES"/>
-              </w:rPr>
-            </w:pPr>
-          </w:p>
-        </w:tc>
-        <w:tc>
-          <w:tcPr>
-            <w:tcW w:w="3270" w:type="dxa"/>
-          </w:tcPr>
-          <w:p>
-            <w:pPr>
-              <w:jc w:val="center"/>
-              <w:rPr>
-                <w:rFonts w:ascii="Arial" w:hAnsi="Arial" w:cs="Arial"/>
-                <w:lang w:val="es-ES"/>
-              </w:rPr>
-            </w:pPr>
-          </w:p>
-        </w:tc>
-      </w:tr>
-      <w:tr>
-        <w:tc>
-          <w:tcPr>
-            <w:tcW w:w="1617" w:type="dxa"/>
-          </w:tcPr>
-          <w:p>
-            <w:pPr>
-              <w:jc w:val="center"/>
-              <w:rPr>
-                <w:rFonts w:ascii="Arial" w:hAnsi="Arial" w:cs="Arial"/>
-                <w:lang w:val="es-ES"/>
-              </w:rPr>
-            </w:pPr>
-          </w:p>
-        </w:tc>
-        <w:tc>
-          <w:tcPr>
-            <w:tcW w:w="2074" w:type="dxa"/>
-          </w:tcPr>
-          <w:p>
-            <w:pPr>
-              <w:jc w:val="center"/>
-              <w:rPr>
-                <w:rFonts w:ascii="Arial" w:hAnsi="Arial" w:cs="Arial"/>
-                <w:lang w:val="es-ES"/>
-              </w:rPr>
-            </w:pPr>
-          </w:p>
-        </w:tc>
-        <w:tc>
-          <w:tcPr>
-            <w:tcW w:w="1651" w:type="dxa"/>
-          </w:tcPr>
-          <w:p>
-            <w:pPr>
-              <w:jc w:val="center"/>
-              <w:rPr>
-                <w:rFonts w:ascii="Arial" w:hAnsi="Arial" w:cs="Arial"/>
-                <w:lang w:val="es-ES"/>
-              </w:rPr>
-            </w:pPr>
-          </w:p>
-        </w:tc>
-        <w:tc>
-          <w:tcPr>
-            <w:tcW w:w="1731" w:type="dxa"/>
-          </w:tcPr>
-          <w:p>
-            <w:pPr>
-              <w:jc w:val="center"/>
-              <w:rPr>
-                <w:rFonts w:ascii="Arial" w:hAnsi="Arial" w:cs="Arial"/>
-                <w:lang w:val="es-ES"/>
-              </w:rPr>
-            </w:pPr>
-          </w:p>
-        </w:tc>
-        <w:tc>
-          <w:tcPr>
-            <w:tcW w:w="3270" w:type="dxa"/>
-          </w:tcPr>
-          <w:p>
-            <w:pPr>
-              <w:jc w:val="center"/>
-              <w:rPr>
-                <w:rFonts w:ascii="Arial" w:hAnsi="Arial" w:cs="Arial"/>
-                <w:lang w:val="es-ES"/>
-              </w:rPr>
-            </w:pPr>
-          </w:p>
-        </w:tc>
-      </w:tr>
-      <w:tr>
-        <w:tc>
-          <w:tcPr>
-            <w:tcW w:w="1617" w:type="dxa"/>
-          </w:tcPr>
-          <w:p>
-            <w:pPr>
-              <w:jc w:val="center"/>
-              <w:rPr>
-                <w:rFonts w:ascii="Arial" w:hAnsi="Arial" w:cs="Arial"/>
-                <w:lang w:val="es-ES"/>
-              </w:rPr>
-            </w:pPr>
-          </w:p>
-        </w:tc>
-        <w:tc>
-          <w:tcPr>
-            <w:tcW w:w="2074" w:type="dxa"/>
-          </w:tcPr>
-          <w:p>
-            <w:pPr>
-              <w:jc w:val="center"/>
-              <w:rPr>
-                <w:rFonts w:ascii="Arial" w:hAnsi="Arial" w:cs="Arial"/>
-                <w:lang w:val="es-ES"/>
-              </w:rPr>
-            </w:pPr>
-          </w:p>
-        </w:tc>
-        <w:tc>
-          <w:tcPr>
-            <w:tcW w:w="1651" w:type="dxa"/>
-          </w:tcPr>
-          <w:p>
-            <w:pPr>
-              <w:jc w:val="center"/>
-              <w:rPr>
-                <w:rFonts w:ascii="Arial" w:hAnsi="Arial" w:cs="Arial"/>
-                <w:lang w:val="es-ES"/>
-              </w:rPr>
-            </w:pPr>
-          </w:p>
-        </w:tc>
-        <w:tc>
-          <w:tcPr>
-            <w:tcW w:w="1731" w:type="dxa"/>
-          </w:tcPr>
-          <w:p>
-            <w:pPr>
-              <w:jc w:val="center"/>
-              <w:rPr>
-                <w:rFonts w:ascii="Arial" w:hAnsi="Arial" w:cs="Arial"/>
-                <w:lang w:val="es-ES"/>
-              </w:rPr>
-            </w:pPr>
-          </w:p>
-        </w:tc>
-        <w:tc>
-          <w:tcPr>
-            <w:tcW w:w="3270" w:type="dxa"/>
-          </w:tcPr>
-          <w:p>
-            <w:pPr>
-              <w:jc w:val="center"/>
-              <w:rPr>
-                <w:rFonts w:ascii="Arial" w:hAnsi="Arial" w:cs="Arial"/>
-                <w:lang w:val="es-ES"/>
-              </w:rPr>
-            </w:pPr>
-          </w:p>
-        </w:tc>
-      </w:tr>
-      <w:tr>
-        <w:tc>
-          <w:tcPr>
-            <w:tcW w:w="1617" w:type="dxa"/>
-          </w:tcPr>
-          <w:p>
-            <w:pPr>
-              <w:jc w:val="center"/>
-              <w:rPr>
-                <w:rFonts w:ascii="Arial" w:hAnsi="Arial" w:cs="Arial"/>
-                <w:lang w:val="es-ES"/>
-              </w:rPr>
-            </w:pPr>
-          </w:p>
-        </w:tc>
-        <w:tc>
-          <w:tcPr>
-            <w:tcW w:w="2074" w:type="dxa"/>
-          </w:tcPr>
-          <w:p>
-            <w:pPr>
-              <w:jc w:val="center"/>
-              <w:rPr>
-                <w:rFonts w:ascii="Arial" w:hAnsi="Arial" w:cs="Arial"/>
-                <w:lang w:val="es-ES"/>
-              </w:rPr>
-            </w:pPr>
-          </w:p>
-        </w:tc>
-        <w:tc>
-          <w:tcPr>
-            <w:tcW w:w="1651" w:type="dxa"/>
-          </w:tcPr>
-          <w:p>
-            <w:pPr>
-              <w:jc w:val="center"/>
-              <w:rPr>
-                <w:rFonts w:ascii="Arial" w:hAnsi="Arial" w:cs="Arial"/>
-                <w:lang w:val="es-ES"/>
-              </w:rPr>
-            </w:pPr>
-          </w:p>
-        </w:tc>
-        <w:tc>
-          <w:tcPr>
-            <w:tcW w:w="1731" w:type="dxa"/>
-          </w:tcPr>
-          <w:p>
-            <w:pPr>
-              <w:jc w:val="center"/>
-              <w:rPr>
-                <w:rFonts w:ascii="Arial" w:hAnsi="Arial" w:cs="Arial"/>
-                <w:lang w:val="es-ES"/>
-              </w:rPr>
-            </w:pPr>
-          </w:p>
-        </w:tc>
-        <w:tc>
-          <w:tcPr>
-            <w:tcW w:w="3270" w:type="dxa"/>
-          </w:tcPr>
-          <w:p>
-            <w:pPr>
-              <w:jc w:val="center"/>
-              <w:rPr>
-                <w:rFonts w:ascii="Arial" w:hAnsi="Arial" w:cs="Arial"/>
-                <w:lang w:val="es-ES"/>
-              </w:rPr>
-            </w:pPr>
-          </w:p>
-        </w:tc>
-      </w:tr>
-      <w:tr>
-        <w:tc>
-          <w:tcPr>
-            <w:tcW w:w="1617" w:type="dxa"/>
-          </w:tcPr>
-          <w:p>
-            <w:pPr>
-              <w:jc w:val="center"/>
-              <w:rPr>
-                <w:rFonts w:ascii="Arial" w:hAnsi="Arial" w:cs="Arial"/>
-                <w:lang w:val="es-ES"/>
-              </w:rPr>
-            </w:pPr>
-          </w:p>
-        </w:tc>
-        <w:tc>
-          <w:tcPr>
-            <w:tcW w:w="2074" w:type="dxa"/>
-          </w:tcPr>
-          <w:p>
-            <w:pPr>
-              <w:jc w:val="center"/>
-              <w:rPr>
-                <w:rFonts w:ascii="Arial" w:hAnsi="Arial" w:cs="Arial"/>
-                <w:lang w:val="es-ES"/>
-              </w:rPr>
-            </w:pPr>
-          </w:p>
-        </w:tc>
-        <w:tc>
-          <w:tcPr>
-            <w:tcW w:w="1651" w:type="dxa"/>
-          </w:tcPr>
-          <w:p>
-            <w:pPr>
-              <w:jc w:val="center"/>
-              <w:rPr>
-                <w:rFonts w:ascii="Arial" w:hAnsi="Arial" w:cs="Arial"/>
-                <w:lang w:val="es-ES"/>
-              </w:rPr>
-            </w:pPr>
-          </w:p>
-        </w:tc>
-        <w:tc>
-          <w:tcPr>
-            <w:tcW w:w="1731" w:type="dxa"/>
-          </w:tcPr>
-          <w:p>
-            <w:pPr>
-              <w:jc w:val="center"/>
-              <w:rPr>
-                <w:rFonts w:ascii="Arial" w:hAnsi="Arial" w:cs="Arial"/>
-                <w:lang w:val="es-ES"/>
-              </w:rPr>
-            </w:pPr>
-          </w:p>
-        </w:tc>
-        <w:tc>
-          <w:tcPr>
-            <w:tcW w:w="3270" w:type="dxa"/>
-          </w:tcPr>
-          <w:p>
-            <w:pPr>
-              <w:jc w:val="center"/>
-              <w:rPr>
-                <w:rFonts w:ascii="Arial" w:hAnsi="Arial" w:cs="Arial"/>
-                <w:lang w:val="es-ES"/>
-              </w:rPr>
-            </w:pPr>
-          </w:p>
-        </w:tc>
-      </w:tr>
-      <w:tr>
-        <w:tc>
-          <w:tcPr>
-            <w:tcW w:w="1617" w:type="dxa"/>
-          </w:tcPr>
-          <w:p>
-            <w:pPr>
-              <w:jc w:val="center"/>
-              <w:rPr>
-                <w:rFonts w:ascii="Arial" w:hAnsi="Arial" w:cs="Arial"/>
-                <w:lang w:val="es-ES"/>
-              </w:rPr>
-            </w:pPr>
-          </w:p>
-        </w:tc>
-        <w:tc>
-          <w:tcPr>
-            <w:tcW w:w="2074" w:type="dxa"/>
-          </w:tcPr>
-          <w:p>
-            <w:pPr>
-              <w:jc w:val="center"/>
-              <w:rPr>
-                <w:rFonts w:ascii="Arial" w:hAnsi="Arial" w:cs="Arial"/>
-                <w:lang w:val="es-ES"/>
-              </w:rPr>
-            </w:pPr>
-          </w:p>
-        </w:tc>
-        <w:tc>
-          <w:tcPr>
-            <w:tcW w:w="1651" w:type="dxa"/>
-          </w:tcPr>
-          <w:p>
-            <w:pPr>
-              <w:jc w:val="center"/>
-              <w:rPr>
-                <w:rFonts w:ascii="Arial" w:hAnsi="Arial" w:cs="Arial"/>
-                <w:lang w:val="es-ES"/>
-              </w:rPr>
-            </w:pPr>
-          </w:p>
-        </w:tc>
-        <w:tc>
-          <w:tcPr>
-            <w:tcW w:w="1731" w:type="dxa"/>
-          </w:tcPr>
-          <w:p>
-            <w:pPr>
-              <w:jc w:val="center"/>
-              <w:rPr>
-                <w:rFonts w:ascii="Arial" w:hAnsi="Arial" w:cs="Arial"/>
-                <w:lang w:val="es-ES"/>
-              </w:rPr>
-            </w:pPr>
-          </w:p>
-        </w:tc>
-        <w:tc>
-          <w:tcPr>
-            <w:tcW w:w="3270" w:type="dxa"/>
-          </w:tcPr>
-          <w:p>
-            <w:pPr>
-              <w:jc w:val="center"/>
-              <w:rPr>
-                <w:rFonts w:ascii="Arial" w:hAnsi="Arial" w:cs="Arial"/>
-                <w:lang w:val="es-ES"/>
-              </w:rPr>
-            </w:pPr>
-          </w:p>
-        </w:tc>
-      </w:tr>
-      <w:tr>
-        <w:tc>
-          <w:tcPr>
-            <w:tcW w:w="1617" w:type="dxa"/>
-          </w:tcPr>
-          <w:p>
-            <w:pPr>
-              <w:jc w:val="center"/>
-              <w:rPr>
-                <w:rFonts w:ascii="Arial" w:hAnsi="Arial" w:cs="Arial"/>
-                <w:lang w:val="es-ES"/>
-              </w:rPr>
-            </w:pPr>
-          </w:p>
-        </w:tc>
-        <w:tc>
-          <w:tcPr>
-            <w:tcW w:w="2074" w:type="dxa"/>
-          </w:tcPr>
-          <w:p>
-            <w:pPr>
-              <w:jc w:val="center"/>
-              <w:rPr>
-                <w:rFonts w:ascii="Arial" w:hAnsi="Arial" w:cs="Arial"/>
-                <w:lang w:val="es-ES"/>
-              </w:rPr>
-            </w:pPr>
-          </w:p>
-        </w:tc>
-        <w:tc>
-          <w:tcPr>
-            <w:tcW w:w="1651" w:type="dxa"/>
-          </w:tcPr>
-          <w:p>
-            <w:pPr>
-              <w:jc w:val="center"/>
-              <w:rPr>
-                <w:rFonts w:ascii="Arial" w:hAnsi="Arial" w:cs="Arial"/>
-                <w:lang w:val="es-ES"/>
-              </w:rPr>
-            </w:pPr>
-          </w:p>
-        </w:tc>
-        <w:tc>
-          <w:tcPr>
-            <w:tcW w:w="1731" w:type="dxa"/>
-          </w:tcPr>
-          <w:p>
-            <w:pPr>
-              <w:jc w:val="center"/>
-              <w:rPr>
-                <w:rFonts w:ascii="Arial" w:hAnsi="Arial" w:cs="Arial"/>
-                <w:lang w:val="es-ES"/>
-              </w:rPr>
-            </w:pPr>
-          </w:p>
-        </w:tc>
-        <w:tc>
-          <w:tcPr>
-            <w:tcW w:w="3270" w:type="dxa"/>
-          </w:tcPr>
-          <w:p>
-            <w:pPr>
-              <w:jc w:val="center"/>
-              <w:rPr>
-                <w:rFonts w:ascii="Arial" w:hAnsi="Arial" w:cs="Arial"/>
-                <w:lang w:val="es-ES"/>
-              </w:rPr>
-            </w:pPr>
-          </w:p>
-        </w:tc>
-      </w:tr>
-      <w:tr>
-        <w:tc>
-          <w:tcPr>
-            <w:tcW w:w="1617" w:type="dxa"/>
-          </w:tcPr>
-          <w:p>
-            <w:pPr>
-              <w:jc w:val="center"/>
-              <w:rPr>
-                <w:rFonts w:ascii="Arial" w:hAnsi="Arial" w:cs="Arial"/>
-                <w:lang w:val="es-ES"/>
-              </w:rPr>
-            </w:pPr>
-          </w:p>
-        </w:tc>
-        <w:tc>
-          <w:tcPr>
-            <w:tcW w:w="2074" w:type="dxa"/>
-          </w:tcPr>
-          <w:p>
-            <w:pPr>
-              <w:jc w:val="center"/>
-              <w:rPr>
-                <w:rFonts w:ascii="Arial" w:hAnsi="Arial" w:cs="Arial"/>
-                <w:lang w:val="es-ES"/>
-              </w:rPr>
-            </w:pPr>
-          </w:p>
-        </w:tc>
-        <w:tc>
-          <w:tcPr>
-            <w:tcW w:w="1651" w:type="dxa"/>
-          </w:tcPr>
-          <w:p>
-            <w:pPr>
-              <w:jc w:val="center"/>
-              <w:rPr>
-                <w:rFonts w:ascii="Arial" w:hAnsi="Arial" w:cs="Arial"/>
-                <w:lang w:val="es-ES"/>
-              </w:rPr>
-            </w:pPr>
-          </w:p>
-        </w:tc>
-        <w:tc>
-          <w:tcPr>
-            <w:tcW w:w="1731" w:type="dxa"/>
-          </w:tcPr>
-          <w:p>
-            <w:pPr>
-              <w:jc w:val="center"/>
-              <w:rPr>
-                <w:rFonts w:ascii="Arial" w:hAnsi="Arial" w:cs="Arial"/>
-                <w:lang w:val="es-ES"/>
-              </w:rPr>
-            </w:pPr>
-          </w:p>
-        </w:tc>
-        <w:tc>
-          <w:tcPr>
-            <w:tcW w:w="3270" w:type="dxa"/>
-          </w:tcPr>
-          <w:p>
-            <w:pPr>
-              <w:jc w:val="center"/>
-              <w:rPr>
-                <w:rFonts w:ascii="Arial" w:hAnsi="Arial" w:cs="Arial"/>
-                <w:lang w:val="es-ES"/>
-              </w:rPr>
-            </w:pPr>
-          </w:p>
-        </w:tc>
-      </w:tr>
-      <w:tr>
-        <w:tc>
-          <w:tcPr>
-            <w:tcW w:w="1617" w:type="dxa"/>
-          </w:tcPr>
-          <w:p>
-            <w:pPr>
-              <w:jc w:val="center"/>
-              <w:rPr>
-                <w:rFonts w:ascii="Arial" w:hAnsi="Arial" w:cs="Arial"/>
-                <w:lang w:val="es-ES"/>
-              </w:rPr>
-            </w:pPr>
-          </w:p>
-        </w:tc>
-        <w:tc>
-          <w:tcPr>
-            <w:tcW w:w="2074" w:type="dxa"/>
-          </w:tcPr>
-          <w:p>
-            <w:pPr>
-              <w:jc w:val="center"/>
-              <w:rPr>
-                <w:rFonts w:ascii="Arial" w:hAnsi="Arial" w:cs="Arial"/>
-                <w:lang w:val="es-ES"/>
-              </w:rPr>
-            </w:pPr>
-          </w:p>
-        </w:tc>
-        <w:tc>
-          <w:tcPr>
-            <w:tcW w:w="1651" w:type="dxa"/>
-          </w:tcPr>
-          <w:p>
-            <w:pPr>
-              <w:jc w:val="center"/>
-              <w:rPr>
-                <w:rFonts w:ascii="Arial" w:hAnsi="Arial" w:cs="Arial"/>
-                <w:lang w:val="es-ES"/>
-              </w:rPr>
-            </w:pPr>
-          </w:p>
-        </w:tc>
-        <w:tc>
-          <w:tcPr>
-            <w:tcW w:w="1731" w:type="dxa"/>
-          </w:tcPr>
-          <w:p>
-            <w:pPr>
-              <w:jc w:val="center"/>
-              <w:rPr>
-                <w:rFonts w:ascii="Arial" w:hAnsi="Arial" w:cs="Arial"/>
-                <w:lang w:val="es-ES"/>
-              </w:rPr>
-            </w:pPr>
-          </w:p>
-        </w:tc>
-        <w:tc>
-          <w:tcPr>
-            <w:tcW w:w="3270" w:type="dxa"/>
-          </w:tcPr>
-          <w:p>
-            <w:pPr>
-              <w:jc w:val="center"/>
-              <w:rPr>
-                <w:rFonts w:ascii="Arial" w:hAnsi="Arial" w:cs="Arial"/>
-                <w:lang w:val="es-ES"/>
-              </w:rPr>
-            </w:pPr>
-          </w:p>
-        </w:tc>
-      </w:tr>
-      <w:tr>
-        <w:tc>
-          <w:tcPr>
-            <w:tcW w:w="1617" w:type="dxa"/>
-          </w:tcPr>
-          <w:p>
-            <w:pPr>
-              <w:jc w:val="center"/>
-              <w:rPr>
-                <w:rFonts w:ascii="Arial" w:hAnsi="Arial" w:cs="Arial"/>
-                <w:lang w:val="es-ES"/>
-              </w:rPr>
-            </w:pPr>
-          </w:p>
-        </w:tc>
-        <w:tc>
-          <w:tcPr>
-            <w:tcW w:w="2074" w:type="dxa"/>
-          </w:tcPr>
-          <w:p>
-            <w:pPr>
-              <w:jc w:val="center"/>
-              <w:rPr>
-                <w:rFonts w:ascii="Arial" w:hAnsi="Arial" w:cs="Arial"/>
-                <w:lang w:val="es-ES"/>
-              </w:rPr>
-            </w:pPr>
-          </w:p>
-        </w:tc>
-        <w:tc>
-          <w:tcPr>
-            <w:tcW w:w="1651" w:type="dxa"/>
-          </w:tcPr>
-          <w:p>
-            <w:pPr>
-              <w:jc w:val="center"/>
-              <w:rPr>
-                <w:rFonts w:ascii="Arial" w:hAnsi="Arial" w:cs="Arial"/>
-                <w:lang w:val="es-ES"/>
-              </w:rPr>
-            </w:pPr>
-          </w:p>
-        </w:tc>
-        <w:tc>
-          <w:tcPr>
-            <w:tcW w:w="1731" w:type="dxa"/>
-          </w:tcPr>
-          <w:p>
-            <w:pPr>
-              <w:jc w:val="center"/>
-              <w:rPr>
-                <w:rFonts w:ascii="Arial" w:hAnsi="Arial" w:cs="Arial"/>
-                <w:lang w:val="es-ES"/>
-              </w:rPr>
-            </w:pPr>
-          </w:p>
-        </w:tc>
-        <w:tc>
-          <w:tcPr>
-            <w:tcW w:w="3270" w:type="dxa"/>
-          </w:tcPr>
-          <w:p>
-            <w:pPr>
-              <w:jc w:val="center"/>
-              <w:rPr>
-                <w:rFonts w:ascii="Arial" w:hAnsi="Arial" w:cs="Arial"/>
-                <w:lang w:val="es-ES"/>
-              </w:rPr>
-            </w:pPr>
-          </w:p>
-        </w:tc>
-      </w:tr>
-      <w:tr>
-        <w:tc>
-          <w:tcPr>
-            <w:tcW w:w="1617" w:type="dxa"/>
-          </w:tcPr>
-          <w:p>
-            <w:pPr>
-              <w:jc w:val="center"/>
-              <w:rPr>
-                <w:rFonts w:ascii="Arial" w:hAnsi="Arial" w:cs="Arial"/>
-                <w:lang w:val="es-ES"/>
-              </w:rPr>
-            </w:pPr>
-          </w:p>
-        </w:tc>
-        <w:tc>
-          <w:tcPr>
-            <w:tcW w:w="2074" w:type="dxa"/>
-          </w:tcPr>
-          <w:p>
-            <w:pPr>
-              <w:jc w:val="center"/>
-              <w:rPr>
-                <w:rFonts w:ascii="Arial" w:hAnsi="Arial" w:cs="Arial"/>
-                <w:lang w:val="es-ES"/>
-              </w:rPr>
-            </w:pPr>
-          </w:p>
-        </w:tc>
-        <w:tc>
-          <w:tcPr>
-            <w:tcW w:w="1651" w:type="dxa"/>
-          </w:tcPr>
-          <w:p>
-            <w:pPr>
-              <w:jc w:val="center"/>
-              <w:rPr>
-                <w:rFonts w:ascii="Arial" w:hAnsi="Arial" w:cs="Arial"/>
-                <w:lang w:val="es-ES"/>
-              </w:rPr>
-            </w:pPr>
-          </w:p>
-        </w:tc>
-        <w:tc>
-          <w:tcPr>
-            <w:tcW w:w="1731" w:type="dxa"/>
-          </w:tcPr>
-          <w:p>
-            <w:pPr>
-              <w:jc w:val="center"/>
-              <w:rPr>
-                <w:rFonts w:ascii="Arial" w:hAnsi="Arial" w:cs="Arial"/>
-                <w:lang w:val="es-ES"/>
-              </w:rPr>
-            </w:pPr>
-          </w:p>
-        </w:tc>
-        <w:tc>
-          <w:tcPr>
-            <w:tcW w:w="3270" w:type="dxa"/>
-          </w:tcPr>
-          <w:p>
-            <w:pPr>
-              <w:jc w:val="center"/>
-              <w:rPr>
-                <w:rFonts w:ascii="Arial" w:hAnsi="Arial" w:cs="Arial"/>
-                <w:lang w:val="es-ES"/>
-              </w:rPr>
-            </w:pPr>
-          </w:p>
-        </w:tc>
-      </w:tr>
-      <w:tr>
-        <w:tc>
-          <w:tcPr>
-            <w:tcW w:w="1617" w:type="dxa"/>
-          </w:tcPr>
-          <w:p>
-            <w:pPr>
-              <w:jc w:val="center"/>
-              <w:rPr>
-                <w:rFonts w:ascii="Arial" w:hAnsi="Arial" w:cs="Arial"/>
-                <w:lang w:val="es-ES"/>
-              </w:rPr>
-            </w:pPr>
-          </w:p>
-        </w:tc>
-        <w:tc>
-          <w:tcPr>
-            <w:tcW w:w="2074" w:type="dxa"/>
-          </w:tcPr>
-          <w:p>
-            <w:pPr>
-              <w:jc w:val="center"/>
-              <w:rPr>
-                <w:rFonts w:ascii="Arial" w:hAnsi="Arial" w:cs="Arial"/>
-                <w:lang w:val="es-ES"/>
-              </w:rPr>
-            </w:pPr>
-          </w:p>
-        </w:tc>
-        <w:tc>
-          <w:tcPr>
-            <w:tcW w:w="1651" w:type="dxa"/>
-          </w:tcPr>
-          <w:p>
-            <w:pPr>
-              <w:jc w:val="center"/>
-              <w:rPr>
-                <w:rFonts w:ascii="Arial" w:hAnsi="Arial" w:cs="Arial"/>
-                <w:lang w:val="es-ES"/>
-              </w:rPr>
-            </w:pPr>
-          </w:p>
-        </w:tc>
-        <w:tc>
-          <w:tcPr>
-            <w:tcW w:w="1731" w:type="dxa"/>
-          </w:tcPr>
-          <w:p>
-            <w:pPr>
-              <w:jc w:val="center"/>
-              <w:rPr>
-                <w:rFonts w:ascii="Arial" w:hAnsi="Arial" w:cs="Arial"/>
-                <w:lang w:val="es-ES"/>
-              </w:rPr>
-            </w:pPr>
-          </w:p>
-        </w:tc>
-        <w:tc>
-          <w:tcPr>
-            <w:tcW w:w="3270" w:type="dxa"/>
-          </w:tcPr>
-          <w:p>
-            <w:pPr>
-              <w:jc w:val="center"/>
-              <w:rPr>
-                <w:rFonts w:ascii="Arial" w:hAnsi="Arial" w:cs="Arial"/>
-                <w:lang w:val="es-ES"/>
-              </w:rPr>
-            </w:pPr>
-          </w:p>
-        </w:tc>
-      </w:tr>
-      <w:tr>
-        <w:tc>
-          <w:tcPr>
-            <w:tcW w:w="1617" w:type="dxa"/>
-          </w:tcPr>
-          <w:p>
-            <w:pPr>
-              <w:jc w:val="center"/>
-              <w:rPr>
-                <w:rFonts w:ascii="Arial" w:hAnsi="Arial" w:cs="Arial"/>
-                <w:lang w:val="es-ES"/>
-              </w:rPr>
-            </w:pPr>
-          </w:p>
-        </w:tc>
-        <w:tc>
-          <w:tcPr>
-            <w:tcW w:w="2074" w:type="dxa"/>
-          </w:tcPr>
-          <w:p>
-            <w:pPr>
-              <w:jc w:val="center"/>
-              <w:rPr>
-                <w:rFonts w:ascii="Arial" w:hAnsi="Arial" w:cs="Arial"/>
-                <w:lang w:val="es-ES"/>
-              </w:rPr>
-            </w:pPr>
-          </w:p>
-        </w:tc>
-        <w:tc>
-          <w:tcPr>
-            <w:tcW w:w="1651" w:type="dxa"/>
-          </w:tcPr>
-          <w:p>
-            <w:pPr>
-              <w:jc w:val="center"/>
-              <w:rPr>
-                <w:rFonts w:ascii="Arial" w:hAnsi="Arial" w:cs="Arial"/>
-                <w:lang w:val="es-ES"/>
-              </w:rPr>
-            </w:pPr>
-          </w:p>
-        </w:tc>
-        <w:tc>
-          <w:tcPr>
-            <w:tcW w:w="1731" w:type="dxa"/>
-          </w:tcPr>
-          <w:p>
-            <w:pPr>
-              <w:jc w:val="center"/>
-              <w:rPr>
-                <w:rFonts w:ascii="Arial" w:hAnsi="Arial" w:cs="Arial"/>
-                <w:lang w:val="es-ES"/>
-              </w:rPr>
-            </w:pPr>
-          </w:p>
-        </w:tc>
-        <w:tc>
-          <w:tcPr>
-            <w:tcW w:w="3270" w:type="dxa"/>
-          </w:tcPr>
-          <w:p>
-            <w:pPr>
-              <w:jc w:val="center"/>
-              <w:rPr>
-                <w:rFonts w:ascii="Arial" w:hAnsi="Arial" w:cs="Arial"/>
-                <w:lang w:val="es-ES"/>
-              </w:rPr>
-            </w:pPr>
-          </w:p>
-        </w:tc>
-      </w:tr>
-      <w:tr>
-        <w:tc>
-          <w:tcPr>
-            <w:tcW w:w="1617" w:type="dxa"/>
-          </w:tcPr>
-          <w:p>
-            <w:pPr>
-              <w:jc w:val="center"/>
-              <w:rPr>
-                <w:rFonts w:ascii="Arial" w:hAnsi="Arial" w:cs="Arial"/>
-                <w:lang w:val="es-ES"/>
-              </w:rPr>
-            </w:pPr>
-          </w:p>
-        </w:tc>
-        <w:tc>
-          <w:tcPr>
-            <w:tcW w:w="2074" w:type="dxa"/>
-          </w:tcPr>
-          <w:p>
-            <w:pPr>
-              <w:jc w:val="center"/>
-              <w:rPr>
-                <w:rFonts w:ascii="Arial" w:hAnsi="Arial" w:cs="Arial"/>
-                <w:lang w:val="es-ES"/>
-              </w:rPr>
-            </w:pPr>
-          </w:p>
-        </w:tc>
-        <w:tc>
-          <w:tcPr>
-            <w:tcW w:w="1651" w:type="dxa"/>
-          </w:tcPr>
-          <w:p>
-            <w:pPr>
-              <w:jc w:val="center"/>
-              <w:rPr>
-                <w:rFonts w:ascii="Arial" w:hAnsi="Arial" w:cs="Arial"/>
-                <w:lang w:val="es-ES"/>
-              </w:rPr>
-            </w:pPr>
-          </w:p>
-        </w:tc>
-        <w:tc>
-          <w:tcPr>
-            <w:tcW w:w="1731" w:type="dxa"/>
-          </w:tcPr>
-          <w:p>
-            <w:pPr>
-              <w:jc w:val="center"/>
-              <w:rPr>
-                <w:rFonts w:ascii="Arial" w:hAnsi="Arial" w:cs="Arial"/>
-                <w:lang w:val="es-ES"/>
-              </w:rPr>
-            </w:pPr>
-          </w:p>
-        </w:tc>
-        <w:tc>
-          <w:tcPr>
-            <w:tcW w:w="3270" w:type="dxa"/>
-          </w:tcPr>
-          <w:p>
-            <w:pPr>
-              <w:jc w:val="center"/>
-              <w:rPr>
-                <w:rFonts w:ascii="Arial" w:hAnsi="Arial" w:cs="Arial"/>
-                <w:lang w:val="es-ES"/>
-              </w:rPr>
-            </w:pPr>
-          </w:p>
-        </w:tc>
-      </w:tr>
-      <w:tr>
-        <w:tc>
-          <w:tcPr>
-            <w:tcW w:w="1617" w:type="dxa"/>
-          </w:tcPr>
-          <w:p>
-            <w:pPr>
-              <w:jc w:val="center"/>
-              <w:rPr>
-                <w:rFonts w:ascii="Arial" w:hAnsi="Arial" w:cs="Arial"/>
-                <w:lang w:val="es-ES"/>
-              </w:rPr>
-            </w:pPr>
-          </w:p>
-        </w:tc>
-        <w:tc>
-          <w:tcPr>
-            <w:tcW w:w="2074" w:type="dxa"/>
-          </w:tcPr>
-          <w:p>
-            <w:pPr>
-              <w:jc w:val="center"/>
-              <w:rPr>
-                <w:rFonts w:ascii="Arial" w:hAnsi="Arial" w:cs="Arial"/>
-                <w:lang w:val="es-ES"/>
-              </w:rPr>
-            </w:pPr>
-          </w:p>
-        </w:tc>
-        <w:tc>
-          <w:tcPr>
-            <w:tcW w:w="1651" w:type="dxa"/>
-          </w:tcPr>
-          <w:p>
-            <w:pPr>
-              <w:jc w:val="center"/>
-              <w:rPr>
-                <w:rFonts w:ascii="Arial" w:hAnsi="Arial" w:cs="Arial"/>
-                <w:lang w:val="es-ES"/>
-              </w:rPr>
-            </w:pPr>
-          </w:p>
-        </w:tc>
-        <w:tc>
-          <w:tcPr>
-            <w:tcW w:w="1731" w:type="dxa"/>
-          </w:tcPr>
-          <w:p>
-            <w:pPr>
-              <w:jc w:val="center"/>
-              <w:rPr>
-                <w:rFonts w:ascii="Arial" w:hAnsi="Arial" w:cs="Arial"/>
-                <w:lang w:val="es-ES"/>
-              </w:rPr>
-            </w:pPr>
-          </w:p>
-        </w:tc>
-        <w:tc>
-          <w:tcPr>
-            <w:tcW w:w="3270" w:type="dxa"/>
-          </w:tcPr>
-          <w:p>
-            <w:pPr>
-              <w:jc w:val="center"/>
-              <w:rPr>
-                <w:rFonts w:ascii="Arial" w:hAnsi="Arial" w:cs="Arial"/>
-                <w:lang w:val="es-ES"/>
-              </w:rPr>
-            </w:pPr>
-          </w:p>
-        </w:tc>
-      </w:tr>
-      <w:tr>
-        <w:tc>
-          <w:tcPr>
-            <w:tcW w:w="1617" w:type="dxa"/>
-          </w:tcPr>
-          <w:p>
-            <w:pPr>
-              <w:jc w:val="center"/>
-              <w:rPr>
-                <w:rFonts w:ascii="Arial" w:hAnsi="Arial" w:cs="Arial"/>
-                <w:lang w:val="es-ES"/>
-              </w:rPr>
-            </w:pPr>
-          </w:p>
-        </w:tc>
-        <w:tc>
-          <w:tcPr>
-            <w:tcW w:w="2074" w:type="dxa"/>
-          </w:tcPr>
-          <w:p>
-            <w:pPr>
-              <w:jc w:val="center"/>
-              <w:rPr>
-                <w:rFonts w:ascii="Arial" w:hAnsi="Arial" w:cs="Arial"/>
-                <w:lang w:val="es-ES"/>
-              </w:rPr>
-            </w:pPr>
-          </w:p>
-        </w:tc>
-        <w:tc>
-          <w:tcPr>
-            <w:tcW w:w="1651" w:type="dxa"/>
-          </w:tcPr>
-          <w:p>
-            <w:pPr>
-              <w:jc w:val="center"/>
-              <w:rPr>
-                <w:rFonts w:ascii="Arial" w:hAnsi="Arial" w:cs="Arial"/>
-                <w:lang w:val="es-ES"/>
-              </w:rPr>
-            </w:pPr>
-          </w:p>
-        </w:tc>
-        <w:tc>
-          <w:tcPr>
-            <w:tcW w:w="1731" w:type="dxa"/>
-          </w:tcPr>
-          <w:p>
-            <w:pPr>
-              <w:jc w:val="center"/>
-              <w:rPr>
-                <w:rFonts w:ascii="Arial" w:hAnsi="Arial" w:cs="Arial"/>
-                <w:lang w:val="es-ES"/>
-              </w:rPr>
-            </w:pPr>
-          </w:p>
-        </w:tc>
-        <w:tc>
-          <w:tcPr>
-            <w:tcW w:w="3270" w:type="dxa"/>
-          </w:tcPr>
-          <w:p>
-            <w:pPr>
-              <w:jc w:val="center"/>
-              <w:rPr>
-                <w:rFonts w:ascii="Arial" w:hAnsi="Arial" w:cs="Arial"/>
-                <w:lang w:val="es-ES"/>
-              </w:rPr>
-            </w:pPr>
-          </w:p>
-        </w:tc>
-      </w:tr>
-      <w:tr>
-        <w:tc>
-          <w:tcPr>
-            <w:tcW w:w="1617" w:type="dxa"/>
-          </w:tcPr>
-          <w:p>
-            <w:pPr>
-              <w:jc w:val="center"/>
-              <w:rPr>
-                <w:rFonts w:ascii="Arial" w:hAnsi="Arial" w:cs="Arial"/>
-                <w:lang w:val="es-ES"/>
-              </w:rPr>
-            </w:pPr>
-          </w:p>
-        </w:tc>
-        <w:tc>
-          <w:tcPr>
-            <w:tcW w:w="2074" w:type="dxa"/>
-          </w:tcPr>
-          <w:p>
-            <w:pPr>
-              <w:jc w:val="center"/>
-              <w:rPr>
-                <w:rFonts w:ascii="Arial" w:hAnsi="Arial" w:cs="Arial"/>
-                <w:lang w:val="es-ES"/>
-              </w:rPr>
-            </w:pPr>
-          </w:p>
-        </w:tc>
-        <w:tc>
-          <w:tcPr>
-            <w:tcW w:w="1651" w:type="dxa"/>
-          </w:tcPr>
-          <w:p>
-            <w:pPr>
-              <w:jc w:val="center"/>
-              <w:rPr>
-                <w:rFonts w:ascii="Arial" w:hAnsi="Arial" w:cs="Arial"/>
-                <w:lang w:val="es-ES"/>
-              </w:rPr>
-            </w:pPr>
-          </w:p>
-        </w:tc>
-        <w:tc>
-          <w:tcPr>
-            <w:tcW w:w="1731" w:type="dxa"/>
-          </w:tcPr>
-          <w:p>
-            <w:pPr>
-              <w:jc w:val="center"/>
-              <w:rPr>
-                <w:rFonts w:ascii="Arial" w:hAnsi="Arial" w:cs="Arial"/>
-                <w:lang w:val="es-ES"/>
-              </w:rPr>
-            </w:pPr>
-          </w:p>
-        </w:tc>
-        <w:tc>
-          <w:tcPr>
-            <w:tcW w:w="3270" w:type="dxa"/>
-          </w:tcPr>
-          <w:p>
-            <w:pPr>
-              <w:jc w:val="center"/>
-              <w:rPr>
-                <w:rFonts w:ascii="Arial" w:hAnsi="Arial" w:cs="Arial"/>
-                <w:lang w:val="es-ES"/>
-              </w:rPr>
-            </w:pPr>
-          </w:p>
-        </w:tc>
-      </w:tr>
-      <w:tr>
-        <w:tc>
-          <w:tcPr>
-            <w:tcW w:w="1617" w:type="dxa"/>
-          </w:tcPr>
-          <w:p>
-            <w:pPr>
-              <w:jc w:val="center"/>
-              <w:rPr>
-                <w:rFonts w:ascii="Arial" w:hAnsi="Arial" w:cs="Arial"/>
-                <w:lang w:val="es-ES"/>
-              </w:rPr>
-            </w:pPr>
-          </w:p>
-        </w:tc>
-        <w:tc>
-          <w:tcPr>
-            <w:tcW w:w="2074" w:type="dxa"/>
-          </w:tcPr>
-          <w:p>
-            <w:pPr>
-              <w:jc w:val="center"/>
-              <w:rPr>
-                <w:rFonts w:ascii="Arial" w:hAnsi="Arial" w:cs="Arial"/>
-                <w:lang w:val="es-ES"/>
-              </w:rPr>
-            </w:pPr>
-          </w:p>
-        </w:tc>
-        <w:tc>
-          <w:tcPr>
-            <w:tcW w:w="1651" w:type="dxa"/>
-          </w:tcPr>
-          <w:p>
-            <w:pPr>
-              <w:jc w:val="center"/>
-              <w:rPr>
-                <w:rFonts w:ascii="Arial" w:hAnsi="Arial" w:cs="Arial"/>
-                <w:lang w:val="es-ES"/>
-              </w:rPr>
-            </w:pPr>
-          </w:p>
-        </w:tc>
-        <w:tc>
-          <w:tcPr>
-            <w:tcW w:w="1731" w:type="dxa"/>
-          </w:tcPr>
-          <w:p>
-            <w:pPr>
-              <w:jc w:val="center"/>
-              <w:rPr>
-                <w:rFonts w:ascii="Arial" w:hAnsi="Arial" w:cs="Arial"/>
-                <w:lang w:val="es-ES"/>
-              </w:rPr>
-            </w:pPr>
-          </w:p>
-        </w:tc>
-        <w:tc>
-          <w:tcPr>
-            <w:tcW w:w="3270" w:type="dxa"/>
-          </w:tcPr>
-          <w:p>
-            <w:pPr>
-              <w:jc w:val="center"/>
-              <w:rPr>
-                <w:rFonts w:ascii="Arial" w:hAnsi="Arial" w:cs="Arial"/>
-                <w:lang w:val="es-ES"/>
-              </w:rPr>
-            </w:pPr>
-          </w:p>
-        </w:tc>
-      </w:tr>
-      <w:tr>
-        <w:tc>
-          <w:tcPr>
-            <w:tcW w:w="1617" w:type="dxa"/>
-          </w:tcPr>
-          <w:p>
-            <w:pPr>
-              <w:jc w:val="center"/>
-              <w:rPr>
-                <w:rFonts w:ascii="Arial" w:hAnsi="Arial" w:cs="Arial"/>
-                <w:lang w:val="es-ES"/>
-              </w:rPr>
-            </w:pPr>
-          </w:p>
-        </w:tc>
-        <w:tc>
-          <w:tcPr>
-            <w:tcW w:w="2074" w:type="dxa"/>
-          </w:tcPr>
-          <w:p>
-            <w:pPr>
-              <w:jc w:val="center"/>
-              <w:rPr>
-                <w:rFonts w:ascii="Arial" w:hAnsi="Arial" w:cs="Arial"/>
-                <w:lang w:val="es-ES"/>
-              </w:rPr>
-            </w:pPr>
-          </w:p>
-        </w:tc>
-        <w:tc>
-          <w:tcPr>
-            <w:tcW w:w="1651" w:type="dxa"/>
-          </w:tcPr>
-          <w:p>
-            <w:pPr>
-              <w:jc w:val="center"/>
-              <w:rPr>
-                <w:rFonts w:ascii="Arial" w:hAnsi="Arial" w:cs="Arial"/>
-                <w:lang w:val="es-ES"/>
-              </w:rPr>
-            </w:pPr>
-          </w:p>
-        </w:tc>
-        <w:tc>
-          <w:tcPr>
-            <w:tcW w:w="1731" w:type="dxa"/>
-          </w:tcPr>
-          <w:p>
-            <w:pPr>
-              <w:jc w:val="center"/>
-              <w:rPr>
-                <w:rFonts w:ascii="Arial" w:hAnsi="Arial" w:cs="Arial"/>
-                <w:lang w:val="es-ES"/>
-              </w:rPr>
-            </w:pPr>
-          </w:p>
-        </w:tc>
-        <w:tc>
-          <w:tcPr>
-            <w:tcW w:w="3270" w:type="dxa"/>
-          </w:tcPr>
-          <w:p>
-            <w:pPr>
-              <w:jc w:val="center"/>
-              <w:rPr>
-                <w:rFonts w:ascii="Arial" w:hAnsi="Arial" w:cs="Arial"/>
-                <w:lang w:val="es-ES"/>
-              </w:rPr>
-            </w:pPr>
+          <w:p>
+            <w:pPr>
+              <w:jc w:val="center"/>
+              <w:rPr>
+                <w:rFonts w:ascii="Arial" w:hAnsi="Arial" w:cs="Arial"/>
+                <w:lang w:val="es-ES"/>
+              </w:rPr>
+            </w:pPr>
+            <w:r>
+              <w:rPr>
+                <w:rFonts w:ascii="Arial" w:hAnsi="Arial" w:cs="Arial"/>
+                <w:lang w:val="es-ES"/>
+              </w:rPr>
+              <w:t xml:space="preserve">Usar </w:t>
+            </w:r>
+            <w:proofErr w:type="spellStart"/>
+            <w:r>
+              <w:rPr>
+                <w:rFonts w:ascii="Arial" w:hAnsi="Arial" w:cs="Arial"/>
+                <w:lang w:val="es-ES"/>
+              </w:rPr>
+              <w:t>frameworks</w:t>
+            </w:r>
+            <w:proofErr w:type="spellEnd"/>
+            <w:r>
+              <w:rPr>
+                <w:rFonts w:ascii="Arial" w:hAnsi="Arial" w:cs="Arial"/>
+                <w:lang w:val="es-ES"/>
+              </w:rPr>
+              <w:t xml:space="preserve">, librerías, APIS, </w:t>
+            </w:r>
+            <w:proofErr w:type="spellStart"/>
+            <w:r>
+              <w:rPr>
+                <w:rFonts w:ascii="Arial" w:hAnsi="Arial" w:cs="Arial"/>
+                <w:lang w:val="es-ES"/>
+              </w:rPr>
+              <w:t>Saas</w:t>
+            </w:r>
+            <w:proofErr w:type="spellEnd"/>
+            <w:r>
+              <w:rPr>
+                <w:rFonts w:ascii="Arial" w:hAnsi="Arial" w:cs="Arial"/>
+                <w:lang w:val="es-ES"/>
+              </w:rPr>
+              <w:t xml:space="preserve"> u otras herramientas / técnicas avanzadas.</w:t>
+            </w:r>
           </w:p>
         </w:tc>
       </w:tr>
     </w:tbl>
     <w:p>
       <w:pPr>
+        <w:jc w:val="center"/>
         <w:rPr>
           <w:rFonts w:ascii="Arial" w:hAnsi="Arial" w:cs="Arial"/>
           <w:lang w:val="es-ES"/>
         </w:rPr>
       </w:pPr>
+      <w:bookmarkStart w:id="0" w:name="_GoBack"/>
+      <w:bookmarkEnd w:id="0"/>
     </w:p>
     <w:sectPr>
       <w:pgSz w:w="12240" w:h="15840"/>
@@ -6836,6 +5789,17 @@
       </w:tblBorders>
     </w:tblPr>
   </w:style>
+  <w:style w:type="character" w:styleId="Textoennegrita">
+    <w:name w:val="Strong"/>
+    <w:basedOn w:val="Fuentedeprrafopredeter"/>
+    <w:uiPriority w:val="22"/>
+    <w:qFormat/>
+    <w:rsid w:val="001D72F2"/>
+    <w:rPr>
+      <w:b/>
+      <w:bCs/>
+    </w:rPr>
+  </w:style>
 </w:styles>
 </file>
 

</xml_diff>